<commit_message>
Rewrite interview preparation around DJI and lululemon
</commit_message>
<xml_diff>
--- a/interview_answers.docx
+++ b/interview_answers.docx
@@ -15,7 +15,9 @@
         <w:pStyle w:val="Subtitle"/>
       </w:pPr>
       <w:r>
-        <w:t>67道专业题｜英文口语答案与中文记忆提纲</w:t>
+        <w:t>第二版｜DJI × lululemon</w:t>
+        <w:br/>
+        <w:t>67道英文口语答案与中文记忆提纲</w:t>
       </w:r>
     </w:p>
     <w:p>
@@ -23,47 +25,235 @@
         <w:pStyle w:val="Heading1"/>
       </w:pPr>
       <w:r>
-        <w:t>使用说明</w:t>
-      </w:r>
-    </w:p>
-    <w:p>
-      <w:r>
-        <w:t>对应原文“专业题”1—67题，保留原顺序；不包含自我介绍、行为题、开放题或写作题。附件中的流程说明作为背景资料处理。</w:t>
-      </w:r>
-    </w:p>
-    <w:p>
-      <w:r>
-        <w:t>每题英文约100词，中文提纲供口头回忆。标准正文按空格计词；连字符词按一个词计算。具体词数见各题。</w:t>
-      </w:r>
-    </w:p>
-    <w:p>
-      <w:r>
-        <w:t>建议用“直接观点→两个理由/方法→案例→局限或判断”来讲，而非逐字背诵。约100词通常适合一分钟左右，仍需按个人语速计时。</w:t>
-      </w:r>
-    </w:p>
-    <w:p>
-      <w:r>
-        <w:t>第4题是个人经历模板：必须用你的真实项目、贡献和结果替换，不能原样当成已发生经历。第18题的品牌偏好也应符合你本人。其他假设案例均不表示你任职或参与过相关项目。</w:t>
-      </w:r>
-    </w:p>
-    <w:p>
-      <w:r>
-        <w:t>第37题英文marketing structures与中文“市场结构”不完全一致，正文按market structures作答；如面试官指营销部门组织，可先澄清，再谈职能制、产品制、区域制或矩阵制及协作取舍。</w:t>
-      </w:r>
-    </w:p>
-    <w:p>
-      <w:r>
-        <w:t>第46题“营销矩阵”按marketing mix理解。若对方指规划矩阵，可改谈“人群×渠道”或“旅程阶段×内容”的配置，并说明各格的目标、负责人和衡量指标。</w:t>
-      </w:r>
-    </w:p>
-    <w:p>
-      <w:r>
-        <w:t>第64题采用Duolingo 2025年2月“Duo is dead”活动，未声称它是最新活动或虚报业绩。面试前可换成时间更近、你已核实的活动，沿用目标→创意→参与→结果→限制结构。</w:t>
-      </w:r>
-    </w:p>
-    <w:p>
-      <w:r>
-        <w:t>这些是有条件的策略判断，不是附带实证数据的案例研究。没有可靠数据时区分传播表现与商业成功；需要数据时先核实，不编造增长率。</w:t>
+        <w:t>使用说明与核实状态</w:t>
+      </w:r>
+    </w:p>
+    <w:p>
+      <w:r>
+        <w:t>第二版：仅用DJI（大疆）与lululemon作为品牌案例，67题按附件“专业题”的顺序重写。每题约100词英文口语答案，另附中文记忆提纲。</w:t>
+      </w:r>
+    </w:p>
+    <w:p>
+      <w:r>
+        <w:t>记忆主线：大疆把“想记录”变成“拍得成”；lululemon把“想运动”变成“愿参与、能持续”。两条主线是本文的策略分析，不是品牌官方口号。</w:t>
+      </w:r>
+    </w:p>
+    <w:p>
+      <w:r>
+        <w:t>本轮官网访问受到环境网络策略拦截，未完成实时资料核验。不能把本资料说成已核实的最新案例研究。本文采用已有公开知识、保守的产品定位与明确标识的分析，不引用未经核实的销量、转化率或活动效果。</w:t>
+      </w:r>
+    </w:p>
+    <w:p>
+      <w:r>
+        <w:t>产品以Pocket、Action系列为讨论对象，Pocket 3、Action 5 Pro仅用作已知产品参考，不称它们为最新型号。具体功能、价格、权益和市场供应应在面试前查看当地官网。</w:t>
+      </w:r>
+    </w:p>
+    <w:p>
+      <w:r>
+        <w:t>事实、分析、建议分开：品牌案例提供事实背景；市场洞察与竞争框架是分析；文中“I would”“could”等多为拟议方法，不能转述成品牌已经实施的项目。</w:t>
+      </w:r>
+    </w:p>
+    <w:p>
+      <w:r>
+        <w:t>第4题是个人经历模板：必须补上你的真实项目、人群、贡献、结果和教训，不可把它当成已发生经历。第18题的偏好也须符合本人。</w:t>
+      </w:r>
+    </w:p>
+    <w:p>
+      <w:r>
+        <w:t>第37题按中文“市场结构”解释为market structures；若指marketing organisation，可先澄清并改谈职能、产品、区域或矩阵组织。第46题按marketing mix解释；若指规划矩阵，可改谈人群×渠道或旅程阶段×内容。</w:t>
+      </w:r>
+    </w:p>
+    <w:p>
+      <w:r>
+        <w:t>第54题按你的要求改为DJI与lululemon战略比较。第60题比较两公司差异化机制，明确它们跨品类；若追问“同品类两家公司”，此双品牌限制下不能严格满足，Pocket/Action可用于产品线比较但不是两家公司。</w:t>
+      </w:r>
+    </w:p>
+    <w:p>
+      <w:r>
+        <w:t>第6、49、64题用lululemon 2024年Lunar New Year影片Be Spring作历史案例。第64原题要求recent：截至2026年10月，这不是近期案例。若面试严格要求近期，需补充已核实的最新活动；本文保留日期并直接承认限制，避免编造。</w:t>
+      </w:r>
+    </w:p>
+    <w:p>
+      <w:r>
+        <w:t>建议表达结构：观点→具体机制/方法→案例→限制或取舍。每篇104—112词左右，以你的实际语速计时练习；中文提纲用于重建逻辑，避免逐字背诵。</w:t>
+      </w:r>
+    </w:p>
+    <w:p>
+      <w:pPr>
+        <w:pStyle w:val="Heading1"/>
+      </w:pPr>
+      <w:r>
+        <w:t>两个素材的深度拆解</w:t>
+      </w:r>
+    </w:p>
+    <w:p>
+      <w:pPr>
+        <w:pStyle w:val="Heading2"/>
+      </w:pPr>
+      <w:r>
+        <w:t>素材一｜大疆：从画面结果到创作信心</w:t>
+      </w:r>
+    </w:p>
+    <w:p>
+      <w:r>
+        <w:rPr>
+          <w:b/>
+        </w:rPr>
+        <w:t>案例基础｜已有公开背景：</w:t>
+      </w:r>
+      <w:r>
+        <w:t>大疆是中国品牌，Pocket与Action是其消费级影像产品线。Pocket强调便携、稳定拍摄与日常叙事；Action更面向运动和较严苛环境的记录。具体型号能力需分别核实，不能把所有Pocket/Action产品说成同一套参数。本文讨论相机，不把无人机的所有监管风险直接套到消费相机。</w:t>
+      </w:r>
+    </w:p>
+    <w:p>
+      <w:r>
+        <w:rPr>
+          <w:b/>
+        </w:rPr>
+        <w:t>核心洞察｜顾客竞争的是“任务”，不只是设备：</w:t>
+      </w:r>
+      <w:r>
+        <w:t>顾客不一定想成为专业摄影师，可能只是想把旅行、家人或运动记录得更好。购买障碍不只在画质：多带一个设备、现场操作、社交尴尬、素材传输和剪辑都可能阻止行动。因此大疆也在与“手机已经够用”和“干脆不拍”竞争。这是分析框架，需要访谈和行为证据验证，不能当作全体顾客的既定想法。</w:t>
+      </w:r>
+    </w:p>
+    <w:p>
+      <w:r>
+        <w:rPr>
+          <w:b/>
+        </w:rPr>
+        <w:t>产品细分｜同一顾客在不同场景有不同需要：</w:t>
+      </w:r>
+      <w:r>
+        <w:t>Pocket与Action的价值不能简单概括为谁更好。日常叙事可能重视平稳画面、操作与携带便利；运动记录可能更重视安装、环境适应和运动条件下的可用性。按场景细分，比“年轻人都爱拍视频”更有解释力。产品线关系可以是互补，也可能相互替代，需要看实际用途和预算。</w:t>
+      </w:r>
+    </w:p>
+    <w:p>
+      <w:r>
+        <w:rPr>
+          <w:b/>
+        </w:rPr>
+        <w:t>营销机制｜漂亮结果吸引，透明过程建立信任：</w:t>
+      </w:r>
+      <w:r>
+        <w:t>成片能让价值可见，但也可能让初学者怀疑“这是高手才能拍出来”。更有说服力的演示应呈现拍摄条件、设置、技能和必要剪辑，让观众判断自己能否复现。这里的创新建议是从result demonstration升级到process transparency：不仅展现效果，也诚实展现取得效果的成本。</w:t>
+      </w:r>
+    </w:p>
+    <w:p>
+      <w:r>
+        <w:rPr>
+          <w:b/>
+        </w:rPr>
+        <w:t>建议方案｜“从一个可完成的镜头开始”：</w:t>
+      </w:r>
+      <w:r>
+        <w:t>为一个明确新手场景设计小型试点：一条成片→对应拍摄过程→Pocket/Action选型说明→可尝试的第一项拍摄任务→购后指导。这是本文提出的方案，不是大疆已上线项目。应测试它是否比单纯展示成片更能提升正确选型、满意度和使用，而不是只看观看次数。</w:t>
+      </w:r>
+    </w:p>
+    <w:p>
+      <w:r>
+        <w:rPr>
+          <w:b/>
+        </w:rPr>
+        <w:t>商业判断与边界：</w:t>
+      </w:r>
+      <w:r>
+        <w:t>更高转化不总是更好：不适合的买家可能带来退货、闲置和信任损失。成功可看有效考虑、知情购买、成功使用与推荐；要计入内容和服务成本。专用设备若没有明显场景优势，诚实承认手机足够，反而可能保护长期品牌可信度。</w:t>
+      </w:r>
+    </w:p>
+    <w:p>
+      <w:r>
+        <w:rPr>
+          <w:b/>
+        </w:rPr>
+        <w:t>一句英文主张：</w:t>
+      </w:r>
+      <w:r>
+        <w:t>DJI earns its place when it makes a meaningful moment easier to capture, not merely when it offers better specifications.</w:t>
+      </w:r>
+    </w:p>
+    <w:p>
+      <w:pPr>
+        <w:pStyle w:val="Heading2"/>
+      </w:pPr>
+      <w:r>
+        <w:t>素材二｜lululemon：从运动形象到可参与的习惯</w:t>
+      </w:r>
+    </w:p>
+    <w:p>
+      <w:r>
+        <w:rPr>
+          <w:b/>
+        </w:rPr>
+        <w:t>案例基础｜已有公开背景：</w:t>
+      </w:r>
+      <w:r>
+        <w:t>lululemon经营技术运动服装，并以本地大使和运动社区关系作为品牌接触点之一。Be Spring是其2024年新春影片，出现杨紫琼与咏春舞者，将运动与新春更新、中国文化表达联系起来。这里不声称访问或核实了当前官网，不引用未经核实的票房式传播数字或销售增幅。</w:t>
+      </w:r>
+    </w:p>
+    <w:p>
+      <w:r>
+        <w:rPr>
+          <w:b/>
+        </w:rPr>
+        <w:t>核心洞察｜运动意图与持续参与之间存在缺口：</w:t>
+      </w:r>
+      <w:r>
+        <w:t>人们可能想运动，但顾虑能力、时间、被评价或不知道从哪里开始。社区价值可以是降低这些障碍，而不只是让既有运动人群聚在一起。此处的具体障碍是研究假设，不是已证明lululemon顾客都有同样问题。提问时应纳入首次参与者、未参加者和退出者。</w:t>
+      </w:r>
+    </w:p>
+    <w:p>
+      <w:r>
+        <w:rPr>
+          <w:b/>
+        </w:rPr>
+        <w:t>营销机制｜品牌从被观看变成被体验：</w:t>
+      </w:r>
+      <w:r>
+        <w:t>本地导师与参与式活动可能比远距离代言更贴近日常生活。服装性能提供功能基础，可信的人和体验使运动认同可参与。关键区别是borrowed attention与earned proximity：不是只借到一个人的粉丝，而是通过有用实践建立近距离关系。这是对机制的分析，不是断言所有大使合作都有效。</w:t>
+      </w:r>
+    </w:p>
+    <w:p>
+      <w:r>
+        <w:rPr>
+          <w:b/>
+        </w:rPr>
+        <w:t>Be Spring｜文化表达不是贴一层节日装饰：</w:t>
+      </w:r>
+      <w:r>
+        <w:t>有价值的文化传播让节日主题与品牌核心互相解释：新春更新、身体运动与咏春表达形成可理解的联系。明星应服务主题，而不是替代主题。它可用于讨论拓展运动意义、文化相关性和故事营销；不能仅因影片有明星就宣称改变了品牌形象或带动增长。</w:t>
+      </w:r>
+    </w:p>
+    <w:p>
+      <w:r>
+        <w:rPr>
+          <w:b/>
+        </w:rPr>
+        <w:t>建议方案｜把首次参与变成可实现的复返：</w:t>
+      </w:r>
+      <w:r>
+        <w:t>可测试一条新人旅程：说明活动强度与适合水平→友好首次体验→允许低压力参与→清楚的下一次选择→经许可的跟进。这是拟议方案，不是品牌现有官方项目。可比较有无这些支持时的首次到场、复返和体验感，避免只奖励最活跃的人。</w:t>
+      </w:r>
+    </w:p>
+    <w:p>
+      <w:r>
+        <w:rPr>
+          <w:b/>
+        </w:rPr>
+        <w:t>商业判断与边界：</w:t>
+      </w:r>
+      <w:r>
+        <w:t>社区不是免费流量：导师、场地、组织和跟进都有成本。忠粉多、现场热闹不证明活动吸引了新人；会员多也不等于忠诚。应评估增量参与、持续偏好与全成本，并思考高端定价和包容邀请之间的张力。可改善参与可访问性，但不能假装价格障碍不存在。</w:t>
+      </w:r>
+    </w:p>
+    <w:p>
+      <w:r>
+        <w:rPr>
+          <w:b/>
+        </w:rPr>
+        <w:t>一句英文主张：</w:t>
+      </w:r>
+      <w:r>
+        <w:t>Lululemon is more compelling when movement becomes something people can join, not an identity they must already possess.</w:t>
       </w:r>
     </w:p>
     <w:p>
@@ -92,7 +282,7 @@
           </w:tcPr>
           <w:p>
             <w:r>
-              <w:t>素材</w:t>
+              <w:t>主线</w:t>
             </w:r>
           </w:p>
         </w:tc>
@@ -102,7 +292,7 @@
           </w:tcPr>
           <w:p>
             <w:r>
-              <w:t>主要题号</w:t>
+              <w:t>题号</w:t>
             </w:r>
           </w:p>
         </w:tc>
@@ -112,7 +302,7 @@
           </w:tcPr>
           <w:p>
             <w:r>
-              <w:t>记忆主线</w:t>
+              <w:t>记忆逻辑</w:t>
             </w:r>
           </w:p>
         </w:tc>
@@ -124,7 +314,7 @@
           </w:tcPr>
           <w:p>
             <w:r>
-              <w:t>A｜Apple：价值呈现、生态与一致性</w:t>
+              <w:t>DJI｜创作信心与流程透明</w:t>
             </w:r>
           </w:p>
         </w:tc>
@@ -134,7 +324,7 @@
           </w:tcPr>
           <w:p>
             <w:r>
-              <w:t>5、7、16、17、19、34、51、54、60、61、67</w:t>
+              <w:t>1、3、5、9、13、17、19、23、27、34、36、40、41、43、46、53、57、63、66</w:t>
             </w:r>
           </w:p>
         </w:tc>
@@ -144,7 +334,7 @@
           </w:tcPr>
           <w:p>
             <w:r>
-              <w:t>核心：技术转为生活价值；Shot on iPhone用作品证明能力；传播与体验一致。边界：高价、灵活性、市场差异。</w:t>
+              <w:t>任务→阻碍→过程证据→知情选择→成功使用；Pocket/Action场景细分，竞争包含手机与不行动。</w:t>
             </w:r>
           </w:p>
         </w:tc>
@@ -156,7 +346,7 @@
           </w:tcPr>
           <w:p>
             <w:r>
-              <w:t>B｜Nike：性能、身份与运动员故事</w:t>
+              <w:t>lululemon｜参与、归属与习惯</w:t>
             </w:r>
           </w:p>
         </w:tc>
@@ -166,7 +356,7 @@
           </w:tcPr>
           <w:p>
             <w:r>
-              <w:t>8、18、58；56可辅助使用</w:t>
+              <w:t>8、11、18、20、44、48、58、65、67</w:t>
             </w:r>
           </w:p>
         </w:tc>
@@ -176,7 +366,7 @@
           </w:tcPr>
           <w:p>
             <w:r>
-              <w:t>核心：Just Do It把性能转化为行动与自我认同；运动员故事连接普通人的努力。边界：代言风险与实际行为。</w:t>
+              <w:t>邀请→欢迎→首次参与→复返；大使近距离信任，社区不是销售漏斗或免费流量。</w:t>
             </w:r>
           </w:p>
         </w:tc>
@@ -188,7 +378,7 @@
           </w:tcPr>
           <w:p>
             <w:r>
-              <w:t>C｜Duolingo：鲜明人格与社交参与</w:t>
+              <w:t>lululemon｜Be Spring历史影片</w:t>
             </w:r>
           </w:p>
         </w:tc>
@@ -198,7 +388,7 @@
           </w:tcPr>
           <w:p>
             <w:r>
-              <w:t>1、2、6、11、24、25、35、39、49、52、63、64</w:t>
+              <w:t>6、49、64；67辅助</w:t>
             </w:r>
           </w:p>
         </w:tc>
@@ -208,7 +398,7 @@
           </w:tcPr>
           <w:p>
             <w:r>
-              <w:t>核心：产品角色延伸到社媒；熟悉、幽默、文化参与。边界：热度不等于有效下载、留存或付费。64用2025年2月具体活动。</w:t>
+              <w:t>2024新春＋杨紫琼/咏春舞者；运动、更新、文化连接。策略合理不等于商业效果已证实。</w:t>
             </w:r>
           </w:p>
         </w:tc>
@@ -220,7 +410,7 @@
           </w:tcPr>
           <w:p>
             <w:r>
-              <w:t>D｜Sephora：会员与长期关系</w:t>
+              <w:t>两品牌共用｜价值与衡量</w:t>
             </w:r>
           </w:p>
         </w:tc>
@@ -230,7 +420,7 @@
           </w:tcPr>
           <w:p>
             <w:r>
-              <w:t>20</w:t>
+              <w:t>2、7、14、15、16、24、25、26、30、31、32、35、37、38、39、51、52、54、55、56、59、60、61、62</w:t>
             </w:r>
           </w:p>
         </w:tc>
@@ -240,7 +430,7 @@
           </w:tcPr>
           <w:p>
             <w:r>
-              <w:t>核心：奖励、认可与直接关系。边界：注册会员不等于忠诚；须扣除奖励成本并识别增量。</w:t>
+              <w:t>关注到行为再到经济价值；DJI作品与流程，lululemon真实参与。承诺兑现、对照增量、反证与局限。</w:t>
             </w:r>
           </w:p>
         </w:tc>
@@ -252,7 +442,7 @@
           </w:tcPr>
           <w:p>
             <w:r>
-              <w:t>E｜假设性学习App：通用决策情境</w:t>
+              <w:t>通用方法｜真实经历、融资、宏观与协作</w:t>
             </w:r>
           </w:p>
         </w:tc>
@@ -262,7 +452,7 @@
           </w:tcPr>
           <w:p>
             <w:r>
-              <w:t>3、9、12、13、14、15、23、26、27、36、38、40、41、42、43、44、46、48、55、57、59、65、66</w:t>
+              <w:t>4、10、12、21、22、28、29、33、42、45、47、50</w:t>
             </w:r>
           </w:p>
         </w:tc>
@@ -272,39 +462,7 @@
           </w:tcPr>
           <w:p>
             <w:r>
-              <w:t>用于解释方法，不代表你的个人经历。贯穿：明确人群→理解动机→减少阻碍→验证使用/付费→看留存。</w:t>
-            </w:r>
-          </w:p>
-        </w:tc>
-      </w:tr>
-      <w:tr>
-        <w:tc>
-          <w:tcPr>
-            <w:tcW w:type="dxa" w:w="3360"/>
-          </w:tcPr>
-          <w:p>
-            <w:r>
-              <w:t>F｜可重复方法框架</w:t>
-            </w:r>
-          </w:p>
-        </w:tc>
-        <w:tc>
-          <w:tcPr>
-            <w:tcW w:type="dxa" w:w="3360"/>
-          </w:tcPr>
-          <w:p>
-            <w:r>
-              <w:t>10、21/47、22/50、28/29、31、32/62、33/53、37、45</w:t>
-            </w:r>
-          </w:p>
-        </w:tc>
-        <w:tc>
-          <w:tcPr>
-            <w:tcW w:type="dxa" w:w="3360"/>
-          </w:tcPr>
-          <w:p>
-            <w:r>
-              <w:t>战略vs战术；顾客中心但有边界；部门共定义问题；宏观变化分人群分析；换logo先问目的、再测效果。</w:t>
+              <w:t>真实经历替换；战略vs战术；需求证据与经济性；宏观分情境；共同问题、边界与取舍。</w:t>
             </w:r>
           </w:p>
         </w:tc>
@@ -336,12 +494,12 @@
         <w:rPr>
           <w:b/>
         </w:rPr>
-        <w:t>English answer · 103 words</w:t>
-      </w:r>
-    </w:p>
-    <w:p>
-      <w:r>
-        <w:t>I stay current by combining industry signals with customer evidence. I follow sources such as Think with Google, marketing journals, and platform product updates, but I do not adopt a tactic simply because it is fashionable. I ask what customer problem it solves, whether it fits the brand, and how we could test it. Duolingo's social content is a useful example: its playful tone works because it supports an approachable learning experience. Another company copying the same humour might damage credibility. For me, using the latest strategy means learning quickly and testing carefully, rather than constantly replacing a coherent strategy with new trends.</w:t>
+        <w:t>English · 108 words</w:t>
+      </w:r>
+    </w:p>
+    <w:p>
+      <w:r>
+        <w:t>I keep strategies current by watching changes in customer behaviour before copying changes in marketing fashion. For DJI, I would study why creators choose a phone, a Pocket camera, or an Action camera in different situations. Product updates and industry research matter, but customer workarounds often reveal more useful opportunities. I would then test one hypothesis, such as whether showing the entire filming process is more persuasive than showing polished footage alone. Success would mean more qualified consideration, not simply more views. My principle is to update the evidence behind the strategy while preserving a clear purpose: helping a particular customer achieve a valued outcome with less friction.</w:t>
       </w:r>
     </w:p>
     <w:p>
@@ -352,7 +510,7 @@
         <w:t>中文记忆提纲：</w:t>
       </w:r>
       <w:r>
-        <w:t>信息来源→顾客问题→品牌适配→小规模验证。共用 Duolingo：学机制，不照搬搞笑语气。</w:t>
+        <w:t>更新策略先看行为，不先追热点；DJI手机/Pocket/Action选择→真实拍摄流程实验→有效考虑。更新证据，保留清晰价值目标。</w:t>
       </w:r>
     </w:p>
     <w:p>
@@ -376,12 +534,12 @@
         <w:rPr>
           <w:b/>
         </w:rPr>
-        <w:t>English answer · 104 words</w:t>
-      </w:r>
-    </w:p>
-    <w:p>
-      <w:r>
-        <w:t>To remain relevant as a marketer, I would develop three habits: listening, experimenting, and reflecting. Listening means looking beyond campaign dashboards to understand changing customer expectations. Experimenting means testing ideas on a small scale, with a clear hypothesis and success metric. Reflecting means asking why something worked and whether that explanation will remain valid. I would also strengthen my analytical skills and understanding of privacy, because technical change creates both opportunities and responsibilities. Duolingo illustrates the value of adapting communication to contemporary culture. However, being adaptable should not mean chasing every platform; it should mean changing the execution while keeping the customer value clear.</w:t>
+        <w:t>English · 106 words</w:t>
+      </w:r>
+    </w:p>
+    <w:p>
+      <w:r>
+        <w:t>I would stay relevant by developing the ability to translate between customer experience, technology, and commercial decisions. DJI is a useful example: knowing a camera's specifications is insufficient unless I understand when they change someone's filming experience. I would observe customers, follow credible research, and regularly test my assumptions with small experiments. I would also improve my analytical skills without treating dashboards as substitutes for judgement. For lululemon, that might mean asking whether community events attract newcomers or mostly existing enthusiasts. A relevant marketer does not merely know the newest channel; they recognise when a familiar approach no longer addresses the customer's real barriers to participation.</w:t>
       </w:r>
     </w:p>
     <w:p>
@@ -392,7 +550,7 @@
         <w:t>中文记忆提纲：</w:t>
       </w:r>
       <w:r>
-        <w:t>三习惯：倾听、实验、复盘。补分析与隐私意识；形式灵活，顾客价值稳定。</w:t>
+        <w:t>跟上变化靠客户、技术、商业的翻译能力；DJI参数要落到场景；lululemon活动是吸引新人还是只服务忠粉？数据不能替判断。</w:t>
       </w:r>
     </w:p>
     <w:p>
@@ -416,12 +574,12 @@
         <w:rPr>
           <w:b/>
         </w:rPr>
-        <w:t>English answer · 101 words</w:t>
-      </w:r>
-    </w:p>
-    <w:p>
-      <w:r>
-        <w:t>I would group marketing tools by the decisions they support. Google Analytics helps diagnose website behaviour and conversion journeys. A CRM platform, such as Salesforce or HubSpot, helps organise customer relationships and personalise follow-up. Google Ads supports reaching people with relevant search intent, while social listening tools reveal conversations that surveys may miss. Experimentation tools help compare alternative messages or experiences. However, tools are only useful when the question is clear. For an online learning product, I would combine acquisition data with lesson completion and retention data, because generating registrations is less valuable if customers never develop a sustainable learning habit.</w:t>
+        <w:t>English · 108 words</w:t>
+      </w:r>
+    </w:p>
+    <w:p>
+      <w:r>
+        <w:t>I would choose marketing tools according to the uncertainty I need to resolve. Search analysis can reveal whether DJI customers ask about stable walking footage or filming outdoor activities. Social listening can identify frustrations hidden behind product comparisons. Google Analytics can show where visitors leave the product journey, while a CRM system can support relevant follow-up after a demonstration. Experimentation tools help test alternative explanations of the same benefit. However, none of these tools independently proves customer motivation or campaign impact. I would combine behavioural data with interviews, using technology to sharpen a decision rather than accumulating dashboards that describe activity without explaining what the business should change.</w:t>
       </w:r>
     </w:p>
     <w:p>
@@ -432,7 +590,7 @@
         <w:t>中文记忆提纲：</w:t>
       </w:r>
       <w:r>
-        <w:t>按决策分类：GA看路径；CRM管关系；搜索广告抓意图；社媒监听找洞察；实验比较方案。注册≠留存。</w:t>
+        <w:t>工具对应不确定性：搜索找需求、监听找挫折、GA找流失、CRM做跟进、实验比解释；访谈补动机，工具应导向决策。</w:t>
       </w:r>
     </w:p>
     <w:p>
@@ -453,7 +611,7 @@
     </w:p>
     <w:p>
       <w:r>
-        <w:t>个人经历模板：开口前替换为真实项目；没有相关经历时说明这一点，再谈拟采用的方法。</w:t>
+        <w:t>个人经历模板：请替换真实项目、本人贡献与结果。</w:t>
       </w:r>
     </w:p>
     <w:p>
@@ -461,12 +619,12 @@
         <w:rPr>
           <w:b/>
         </w:rPr>
-        <w:t>English answer · 102 words</w:t>
-      </w:r>
-    </w:p>
-    <w:p>
-      <w:r>
-        <w:t>One strategy I would discuss is an audience-focused campaign for a digital product. The starting point was identifying a specific user problem, rather than promoting every feature. We then connected three stages: content explaining the problem, a landing page showing the product's value, and follow-up messages supporting continued use. My contribution was linking the message to the user journey and choosing metrics for each stage. I would judge the strategy through conversion quality and retention, rather than reach alone. The main lesson was that marketing becomes stronger when communication, product experience, and measurement reinforce one another around a clearly defined customer need.</w:t>
+        <w:t>English · 106 words</w:t>
+      </w:r>
+    </w:p>
+    <w:p>
+      <w:r>
+        <w:t>In a project I worked on, the strategy centred on one specific audience and a barrier preventing action. We used customer feedback to refine the message, then connected awareness content, the landing experience, and follow-up communication. My contribution was linking the promised benefit to the user's next step, rather than promoting every feature equally. I would explain the actual channels, results, and trade-offs from that project. The lesson I would emphasise is that persuasion depends on reducing uncertainty as well as generating interest. DJI provides a useful comparison: impressive footage attracts attention, but explaining how an ordinary user can reproduce it makes the promise more credible.</w:t>
       </w:r>
     </w:p>
     <w:p>
@@ -477,7 +635,7 @@
         <w:t>中文记忆提纲：</w:t>
       </w:r>
       <w:r>
-        <w:t>【个人经历模板，须替换】用户痛点→内容→落地页→后续使用；说清本人贡献、真实指标和教训，勿当成已发生经历。</w:t>
+        <w:t>【真实经历模板】补真实人群/障碍/渠道/本人贡献/结果；勿把模板当经历。主线：不只吸引，还减少不确定性；DJI作品与复现流程对照。</w:t>
       </w:r>
     </w:p>
     <w:p>
@@ -501,12 +659,12 @@
         <w:rPr>
           <w:b/>
         </w:rPr>
-        <w:t>English answer · 103 words</w:t>
-      </w:r>
-    </w:p>
-    <w:p>
-      <w:r>
-        <w:t>I admire Apple's strategy of making complex technology feel understandable and desirable. Its communication usually emphasises what people can do with a product, rather than asking them to interpret technical specifications. This is reinforced by consistent design, retail experiences, and connections between devices. Strategically, the strength is not just advertising; it is the alignment between positioning and the actual customer experience. However, premium pricing can limit accessibility, and a tightly connected ecosystem can create concerns about switching costs. What I would learn from Apple is the importance of consistency: a strong promise becomes credible when the product and the service repeatedly deliver it.</w:t>
+        <w:t>English · 107 words</w:t>
+      </w:r>
+    </w:p>
+    <w:p>
+      <w:r>
+        <w:t>I admire DJI's strategy of making specialist filming capabilities relevant to everyday creators. Pocket and Action cameras can be understood through different jobs: capturing everyday stories smoothly versus recording activities where movement and exposure matter. The stronger marketing message is therefore not 'more technology', but 'less distance between the moment you experience and the story you can share'. Demonstrations can make that promise visible. However, attractive footage alone may conceal the learning effort involved. I would strengthen the strategy by showing realistic workflows and limitations alongside results. This turns inspiration into confidence and addresses an important competitor: the customer's belief that their phone is already good enough.</w:t>
       </w:r>
     </w:p>
     <w:p>
@@ -517,7 +675,7 @@
         <w:t>中文记忆提纲：</w:t>
       </w:r>
       <w:r>
-        <w:t>Apple共用：技术转成生活价值；传播、设计、门店、生态一致。批判点：高价与转换成本。</w:t>
+        <w:t>DJI欣赏点：场景化专业能力→缩短体验与表达距离。Pocket日常故事，Action运动环境；展示流程与限制，挑战“手机够用”。</w:t>
       </w:r>
     </w:p>
     <w:p>
@@ -541,12 +699,12 @@
         <w:rPr>
           <w:b/>
         </w:rPr>
-        <w:t>English answer · 104 words</w:t>
-      </w:r>
-    </w:p>
-    <w:p>
-      <w:r>
-        <w:t>Duolingo is a useful example of online activity changing how a brand is perceived. Its social content gives the owl mascot a humorous, sometimes exaggerated personality, making a learning app feel like a participant in popular culture. This can shift the image from a functional educational tool towards a more familiar and entertaining companion. I would call that successful at attracting attention and building distinctiveness, but I would not assume that viral content automatically improves learning or paid subscriptions. A fuller evaluation would examine brand associations, qualified app downloads, and subsequent retention. The key question is whether the online personality strengthens the product relationship.</w:t>
+        <w:t>English · 105 words</w:t>
+      </w:r>
+    </w:p>
+    <w:p>
+      <w:r>
+        <w:t>Lululemon's 2024 Lunar New Year film, Be Spring, offers an example of online communication broadening a brand's meaning. Featuring Michelle Yeoh and Wing Chun dancers, it connects movement with renewal and Chinese cultural expression, extending beyond a narrow association with yoga clothing. I find the positioning coherent because movement remains central while its emotional meaning becomes broader. However, I would not claim that one film measurably transformed public opinion without evidence. I would test whether viewers associate the brand with more forms of movement and whether that perception encourages consideration. The strategic question is whether cultural relevance expands belonging without weakening the brand's existing credibility.</w:t>
       </w:r>
     </w:p>
     <w:p>
@@ -557,7 +715,7 @@
         <w:t>中文记忆提纲：</w:t>
       </w:r>
       <w:r>
-        <w:t>Duolingo：工具形象→有个性的学习伙伴。传播成功需区分品牌认知、有效下载、留存，不能用爆款代替商业证据。</w:t>
+        <w:t>lululemon 2024 Be Spring《新春，咏春》：杨紫琼＋咏春舞者；运动连接更新与文化。是拓展形象的意图，不虚称已证实改变认知。</w:t>
       </w:r>
     </w:p>
     <w:p>
@@ -581,12 +739,12 @@
         <w:rPr>
           <w:b/>
         </w:rPr>
-        <w:t>English answer · 102 words</w:t>
-      </w:r>
-    </w:p>
-    <w:p>
-      <w:r>
-        <w:t>Apple and Huawei compete in smartphones, but their value propositions and customer contexts differ. Apple emphasises an integrated experience across hardware, software, and services, appealing to people who value convenience, design, and ecosystem continuity. Huawei often highlights engineering capabilities, photography, and connectivity, with its ecosystem particularly relevant in the Chinese market. These are tendencies, not fixed descriptions of every customer. Geographic availability and access to apps also influence choice, so specifications alone cannot explain demand. I would compare particular models within the same market and price range, then examine which benefits each brand makes meaningful to its target customers in everyday use.</w:t>
+        <w:t>English · 108 words</w:t>
+      </w:r>
+    </w:p>
+    <w:p>
+      <w:r>
+        <w:t>DJI and lululemon sell different products, but both turn functional capability into an aspiration customers can pursue. DJI's Pocket and Action cameras serve filming situations such as everyday storytelling and outdoor activity. Lululemon's apparel serves movement, with its broader proposition also shaped by community experiences. Their audiences can overlap: an active traveller might wear technical clothing and record the same outing. However, the buying evidence differs. DJI can demonstrate footage and workflow, while apparel also depends on fit, feel, and repeated use. I would compare the customer jobs and adoption barriers rather than force a specification comparison across categories. Premium value must be experienced, not assumed from price.</w:t>
       </w:r>
     </w:p>
     <w:p>
@@ -597,7 +755,7 @@
         <w:t>中文记忆提纲：</w:t>
       </w:r>
       <w:r>
-        <w:t>Apple/Huawei：生态体验 vs 工程、影像与连接；客户不能刻板分类。比较须同市场、同价位，并考虑应用与渠道可用性。</w:t>
+        <w:t>两公司产品比较：DJI相机服务创作，lululemon服装服务运动与参与；活跃旅行者可重叠。相机看画面流程，服装看合身触感使用；不硬比跨品类参数。</w:t>
       </w:r>
     </w:p>
     <w:p>
@@ -621,12 +779,12 @@
         <w:rPr>
           <w:b/>
         </w:rPr>
-        <w:t>English answer · 105 words</w:t>
-      </w:r>
-    </w:p>
-    <w:p>
-      <w:r>
-        <w:t>Nike's marketing strategy connects product performance with a broader idea of personal achievement. Its athlete partnerships provide credibility, while campaigns such as Just Do It make the message relevant beyond professional sport. The customer is invited to identify as someone who acts despite obstacles. This positioning is reinforced through products, retail experiences, and digital communities. The strategic strength is that Nike sells both functional benefits and an identity customers can participate in. However, inspirational communication must remain consistent with product quality and responsible business practices. Otherwise, the emotional promise becomes vulnerable. I see Nike's strategy as building a recognisable meaning around a credible product proposition.</w:t>
+        <w:t>English · 106 words</w:t>
+      </w:r>
+    </w:p>
+    <w:p>
+      <w:r>
+        <w:t>Lululemon's marketing strategy combines technical apparel with relationships around movement. Its community model includes local ambassadors and activities that can connect the brand to everyday practice, rather than only professional sporting achievement. This gives customers an opportunity to experience the identity the brand represents. My interpretation is that the strongest strategic asset is repeated participation: the brand can become associated with a routine, not just a purchase. However, community should not become a disguised sales funnel. I would assess whether activities create value for participants, welcome different ability levels, and support credible products. Belonging is commercially powerful only when customers experience it as genuine and accessible.</w:t>
       </w:r>
     </w:p>
     <w:p>
@@ -637,7 +795,7 @@
         <w:t>中文记忆提纲：</w:t>
       </w:r>
       <w:r>
-        <w:t>Nike共用：运动性能＋突破自我的身份。运动员背书→Just Do It→社群；价值观须由质量与实际行为支撑。</w:t>
+        <w:t>lululemon：技术服装＋本地大使＋运动活动；核心资产是重复参与、品牌进入生活习惯。避免社区变销售漏斗，兼顾初学者与不同能力。</w:t>
       </w:r>
     </w:p>
     <w:p>
@@ -661,12 +819,12 @@
         <w:rPr>
           <w:b/>
         </w:rPr>
-        <w:t>English answer · 103 words</w:t>
-      </w:r>
-    </w:p>
-    <w:p>
-      <w:r>
-        <w:t>With a limited budget, I would start with one narrow customer segment and one important problem. Spreading resources across many channels usually makes learning harder and messages weaker. For an online learning product, I might focus on useful short-form content, search-friendly answers to common questions, and a simple referral mechanism. I would improve the landing page before paying to attract more visitors, because conversion problems waste scarce resources. A small paid experiment could then test whether the audience and message are promising. My priority would be sustainable acquisition and retention, measured through qualified conversions and customer value, rather than the cheapest possible clicks.</w:t>
+        <w:t>English · 108 words</w:t>
+      </w:r>
+    </w:p>
+    <w:p>
+      <w:r>
+        <w:t>With a limited budget, I would concentrate on one customer barrier and produce evidence that addresses it. For DJI Pocket, that could be a short series showing how a beginner captures a useful sequence, including setup and editing rather than only the final video. Searchable tutorials and a small number of credible creator partnerships could reach people already considering better filming. I would improve the product page before buying more traffic, then test paid promotion selectively. Measurement would focus on qualified consideration and purchase quality. The aim is not the cheapest exposure; it is reducing the specific uncertainty that prevents a suitable customer from taking the next step.</w:t>
       </w:r>
     </w:p>
     <w:p>
@@ -677,7 +835,7 @@
         <w:t>中文记忆提纲：</w:t>
       </w:r>
       <w:r>
-        <w:t>小预算：窄人群、单痛点→内容/搜索/推荐→先修转化→少量广告实验。看有效获客与长期价值，非廉价点击。</w:t>
+        <w:t>小预算DJI：单障碍→初学者全流程教程→搜索＋少量可信创作者→先改产品页→少量投放。减少购买不确定性，比买便宜流量有效。</w:t>
       </w:r>
     </w:p>
     <w:p>
@@ -701,12 +859,12 @@
         <w:rPr>
           <w:b/>
         </w:rPr>
-        <w:t>English answer · 106 words</w:t>
-      </w:r>
-    </w:p>
-    <w:p>
-      <w:r>
-        <w:t>Marketing strategy defines where a business will compete and how it will create distinctive value. It includes choices about target customers, positioning, and the benefits the company can deliver better than alternatives. Marketing tactics are the specific actions used to implement those choices, such as advertising, pricing promotions, email campaigns, or influencer partnerships. Nike provides a simple example: encouraging people to see themselves as athletes is part of its broader positioning, while a particular athlete video is a tactic. The distinction matters because a popular tactic can still be strategically wrong. I would assess an action by its contribution to the intended position and business objective.</w:t>
+        <w:t>English · 110 words</w:t>
+      </w:r>
+    </w:p>
+    <w:p>
+      <w:r>
+        <w:t>Strategy defines the customer, the problem, and the distinctive value a business chooses to deliver. Tactics are the actions used to make that choice effective. For lululemon, positioning around movement and wellbeing is strategic; a local class, ambassador video, or seasonal film is a tactic. The distinction matters because the same activity can support very different strategies. A class designed to welcome beginners creates a different relationship from an exclusive event for established enthusiasts. I would judge tactics by whether they reinforce the intended customer experience and business objective. A creative campaign is not strategically strong simply because people notice it; it must make the chosen value proposition more believable.</w:t>
       </w:r>
     </w:p>
     <w:p>
@@ -717,7 +875,7 @@
         <w:t>中文记忆提纲：</w:t>
       </w:r>
       <w:r>
-        <w:t>战略＝为谁、在哪竞争、凭什么赢；战术＝广告、促销、邮件等动作。Nike定位与单条运动员视频作对照。</w:t>
+        <w:t>战略：人群/问题/独特价值；战术：课程/大使视频/节日片。初学者友好课vs排他活动，形式相同但战略含义不同；关注≠有效。</w:t>
       </w:r>
     </w:p>
     <w:p>
@@ -741,12 +899,12 @@
         <w:rPr>
           <w:b/>
         </w:rPr>
-        <w:t>English answer · 103 words</w:t>
-      </w:r>
-    </w:p>
-    <w:p>
-      <w:r>
-        <w:t>I admire Duolingo's use of a distinctive brand character across its product and social communication. The owl is not simply a decorative mascot; it gives reminders and learning routines an identifiable personality. On social platforms, that personality becomes a flexible source of humour and participation. The innovation lies in connecting product familiarity with culturally relevant content, rather than treating social media as a separate advertising channel. However, the approach requires boundaries: attention-seeking humour can become repetitive or alienate some learners. I would learn from its consistency and speed of experimentation, while adapting the tone to the audience instead of copying the mascot's behaviour.</w:t>
+        <w:t>English · 109 words</w:t>
+      </w:r>
+    </w:p>
+    <w:p>
+      <w:r>
+        <w:t>I admire the idea of treating community participation as a marketing experience rather than a communication channel. Lululemon's local ambassador model illustrates this: a relationship with a trusted instructor can connect a brand to a person's movement routine. The innovation is not simply using influencers; it is creating opportunities for customers to participate in the value the brand promises. I would extend this with beginner-friendly journeys that make returning easier after the first event. However, that is my proposed improvement, not a claim about an existing programme. The important test is whether participation creates lasting value and confidence, rather than serving as a more attractive way to distribute promotions.</w:t>
       </w:r>
     </w:p>
     <w:p>
@@ -757,7 +915,7 @@
         <w:t>中文记忆提纲：</w:t>
       </w:r>
       <w:r>
-        <w:t>Duolingo创新：产品角色延伸为社媒人格；一致性＋快速试验。风险：疲劳、冒犯；借方法，不复制语气。</w:t>
+        <w:t>创新角度：社区不是传播渠道，而是价值体验；lululemon本地导师关系→习惯。建议“新手首次到复返”旅程，明确这是建议非已有项目。</w:t>
       </w:r>
     </w:p>
     <w:p>
@@ -781,12 +939,12 @@
         <w:rPr>
           <w:b/>
         </w:rPr>
-        <w:t>English answer · 104 words</w:t>
-      </w:r>
-    </w:p>
-    <w:p>
-      <w:r>
-        <w:t>I would not ask investors to overlook the absence of profit; I would explain why the business is unprofitable and what could change. There is a major difference between investing ahead of growth and losing money because customers do not value the product. I would present evidence of demand, retention, contribution margins, and a realistic path to covering fixed costs. For a learning app, strong repeat usage would be more persuasive than a large number of downloads. I would also identify risks and propose milestone-based funding. The argument should be that further investment can create sustainable value, not that growth automatically guarantees future profitability.</w:t>
+        <w:t>English · 104 words</w:t>
+      </w:r>
+    </w:p>
+    <w:p>
+      <w:r>
+        <w:t>I would first explain why the project is unprofitable and whether further investment changes the underlying economics. A community-led apparel concept, inspired by lululemon, might spend heavily before repeat purchasing develops, but that is different from customers rejecting the product. I would show evidence of demand, repeat behaviour, gross margins, and contribution after acquisition costs. Community engagement should not be presented as proof of future profit. I would propose milestone-based funding, with clear conditions for expanding or stopping. The persuasive argument is not that the brand has an inspiring mission; it is that investment can remove a demonstrated constraint on delivering customer value sustainably.</w:t>
       </w:r>
     </w:p>
     <w:p>
@@ -797,7 +955,7 @@
         <w:t>中文记忆提纲：</w:t>
       </w:r>
       <w:r>
-        <w:t>亏损原因先分清：前置投入 vs 产品不被需要。需求、留存、贡献利润、盈亏路径→分阶段融资，增长不等于盈利。</w:t>
+        <w:t>亏损融资：区分投入前置与需求不足；社区型服装假设→复购/毛利/获客后贡献→阶段融资和停止条件。参与热闹不能证明未来盈利。</w:t>
       </w:r>
     </w:p>
     <w:p>
@@ -821,12 +979,12 @@
         <w:rPr>
           <w:b/>
         </w:rPr>
-        <w:t>English answer · 103 words</w:t>
-      </w:r>
-    </w:p>
-    <w:p>
-      <w:r>
-        <w:t>The most important part of marketing, for me, is understanding the customer well enough to create meaningful value. Promotion becomes much less effective when the underlying problem is misunderstood. That understanding should include the customer's situation, alternatives, constraints, and reasons for not buying. For a learning app, the real problem may be maintaining motivation rather than accessing more lessons. This changes both product priorities and communication. However, customer understanding is not simply accepting every request; marketers must interpret evidence and make choices. I see marketing as connecting a genuine customer need with a proposition the business can deliver consistently and profitably over time.</w:t>
+        <w:t>English · 110 words</w:t>
+      </w:r>
+    </w:p>
+    <w:p>
+      <w:r>
+        <w:t>The most important part of marketing is identifying the barrier between a customer and an outcome they genuinely value. This goes beyond asking which feature they want. A potential DJI buyer might say they need better footage, but the deeper obstacle could be carrying equipment, operating it confidently, or finding time to edit. Understanding that barrier changes the product message and the support needed after purchase. It also prevents marketing from overselling technical capability. I would therefore combine observation, interviews, and behavioural evidence. Good customer understanding helps a business decide not only what to promote, but which problem deserves solving and whether its solution is meaningfully better than doing nothing.</w:t>
       </w:r>
     </w:p>
     <w:p>
@@ -837,7 +995,7 @@
         <w:t>中文记忆提纲：</w:t>
       </w:r>
       <w:r>
-        <w:t>最重要：理解顾客并创造价值。学习App痛点可能是坚持而非课程少；理解不等于照单全收，还要可交付、可盈利。</w:t>
+        <w:t>营销核心：顾客到目标之间的障碍。DJI“更好视频”可能背后是携带/操作/剪辑成本；理解能决定不该推什么，竞争包括“不行动”。</w:t>
       </w:r>
     </w:p>
     <w:p>
@@ -861,12 +1019,12 @@
         <w:rPr>
           <w:b/>
         </w:rPr>
-        <w:t>English answer · 104 words</w:t>
-      </w:r>
-    </w:p>
-    <w:p>
-      <w:r>
-        <w:t>The most important element of a marketing plan is a clear connection between the customer insight and the business objective. Without that connection, a plan can become a collection of activities rather than a reasoned set of choices. I would specify the target segment, the problem we address, the positioning, and the behaviour we want to change. Then I would select channels, allocate resources, and define measures of success. For a learning app, improving retention requires a different plan from increasing awareness. A useful plan also states its assumptions, so the team knows what to test and when to change direction as evidence develops.</w:t>
+        <w:t>English · 108 words</w:t>
+      </w:r>
+    </w:p>
+    <w:p>
+      <w:r>
+        <w:t>The most important element of a marketing plan is an explicit behavioural objective grounded in customer insight. 'Build community' is too vague unless we know whose behaviour should change and why. For a lululemon initiative, I might aim to help first-time participants return to a movement activity, because repeated participation is more meaningful than one crowded event. The plan would connect that objective to an accessible invitation, a supportive experience, and relevant follow-up. I would define responsibilities, budget, and success measures before launch. A strong plan makes its assumptions visible, so the team can distinguish an ineffective message from a problem with the experience or the underlying proposition.</w:t>
       </w:r>
     </w:p>
     <w:p>
@@ -877,7 +1035,7 @@
         <w:t>中文记忆提纲：</w:t>
       </w:r>
       <w:r>
-        <w:t>计划主线：顾客洞察连接商业目标→人群、痛点、定位、行为→渠道预算指标→写清假设与调整条件。</w:t>
+        <w:t>计划需具体行为目标：“做社区”太空→让首次参与者复返；邀请/体验/跟进/预算责任指标。写清假设，区分消息、体验、命题哪个失败。</w:t>
       </w:r>
     </w:p>
     <w:p>
@@ -901,12 +1059,12 @@
         <w:rPr>
           <w:b/>
         </w:rPr>
-        <w:t>English answer · 104 words</w:t>
-      </w:r>
-    </w:p>
-    <w:p>
-      <w:r>
-        <w:t>I would judge a campaign against the objective agreed before it launched. An awareness campaign might focus on reach within the target audience and changes in brand recall, while an acquisition campaign should examine incremental customers and acquisition costs. For a subscription product, I would also check retention and customer value, because low-quality sign-ups can make short-term results misleading. Where possible, I would use a control group or geographic comparison to distinguish campaign impact from existing demand. Finally, I would consider brand effects and customer complaints. A campaign is successful when it produces valuable behaviour at an acceptable cost without weakening future customer relationships.</w:t>
+        <w:t>English · 107 words</w:t>
+      </w:r>
+    </w:p>
+    <w:p>
+      <w:r>
+        <w:t>I would evaluate a campaign using the behaviour it was designed to change, not the most flattering available metric. For DJI, a demonstration campaign might aim to increase qualified product consideration; for lululemon, a community activation might aim to encourage repeated participation. I would measure the relevant progression, costs, and downstream value, while checking for negative effects such as returns or exclusion. Where feasible, a holdout group or matched comparison would help estimate incremental impact. This matters because enthusiasts may participate anyway. A campaign succeeds when it creates additional customer value and commercial value, rather than merely attracting people who were already likely to buy or attend.</w:t>
       </w:r>
     </w:p>
     <w:p>
@@ -917,7 +1075,7 @@
         <w:t>中文记忆提纲：</w:t>
       </w:r>
       <w:r>
-        <w:t>先定目标，再选指标；认知/增量获客/成本/留存。用对照估增量，兼看品牌和投诉，别把自然需求算广告功劳。</w:t>
+        <w:t>成功衡量：DJI有效考虑；lululemon重复参与→成本/后续价值/退货或排斥→对照估增量。忠粉本来会买会来，不能全算活动功劳。</w:t>
       </w:r>
     </w:p>
     <w:p>
@@ -941,12 +1099,12 @@
         <w:rPr>
           <w:b/>
         </w:rPr>
-        <w:t>English answer · 105 words</w:t>
-      </w:r>
-    </w:p>
-    <w:p>
-      <w:r>
-        <w:t>I think the most important factor in brand success is consistently delivering a distinctive promise. Awareness can encourage a first purchase, but the experience determines whether customers return and recommend the brand. Apple illustrates this through the connection between its promise of an intuitive experience and the way its devices and services work together. Distinctiveness matters because reliable delivery alone may not make a brand memorable or preferable. Consistency matters because a compelling promise becomes meaningless when it fails in practice. Therefore, I would look for alignment across communication, product quality, service, and employee behaviour, rather than treating branding as a visual identity exercise alone.</w:t>
+        <w:t>English · 108 words</w:t>
+      </w:r>
+    </w:p>
+    <w:p>
+      <w:r>
+        <w:t>I think brand success depends on a distinctive promise that customers repeatedly experience as true. For DJI, 'helping me capture the moment' becomes credible when the equipment and workflow make filming manageable in the relevant setting. For lululemon, a promise around movement and belonging depends on both apparel performance and the way people are welcomed. Communication can create expectations, but repeated experiences establish trust. This is why a powerful campaign cannot compensate indefinitely for disappointing products or inaccessible service. I would prioritise coherence across product, communication, and participation. Distinctiveness gives customers a reason to notice; reliable delivery gives them a reason to choose again and recommend the brand.</w:t>
       </w:r>
     </w:p>
     <w:p>
@@ -957,7 +1115,7 @@
         <w:t>中文记忆提纲：</w:t>
       </w:r>
       <w:r>
-        <w:t>品牌成功＝差异化承诺的持续兑现。Apple直观体验＋生态；可记住、值得选、交付稳定，品牌不只是视觉。</w:t>
+        <w:t>成功＝差异承诺反复成真。DJI拍得成，lululemon产品表现＋被欢迎。独特性使人注意，稳定交付使人复选推荐。</w:t>
       </w:r>
     </w:p>
     <w:p>
@@ -981,12 +1139,12 @@
         <w:rPr>
           <w:b/>
         </w:rPr>
-        <w:t>English answer · 105 words</w:t>
-      </w:r>
-    </w:p>
-    <w:p>
-      <w:r>
-        <w:t>For Apple, the key marketing elements are clear positioning, consistent presentation, and a connected customer experience. Product launches translate technical changes into practical benefits, while packaging, stores, and product design reinforce a recognisable identity. Its Shot on iPhone campaign is particularly effective because it shows what customers can create, making the benefit visible rather than merely claiming camera quality. The broader ecosystem then gives existing users reasons to stay. However, I would separate admiration from uncritical loyalty: premium prices and limited flexibility may not suit everyone. Apple stands out because several marketing elements reinforce the same value proposition, rather than relying on one memorable advertisement.</w:t>
+        <w:t>English · 107 words</w:t>
+      </w:r>
+    </w:p>
+    <w:p>
+      <w:r>
+        <w:t>DJI stands out because it can demonstrate value through outcomes customers immediately understand. A stable travel sequence or a clear outdoor recording communicates more than a list of camera specifications. Pocket and Action also provide different entry points into the same broader promise: capturing meaningful experiences. What I would find particularly persuasive is seeing the process behind the result, including what the equipment simplifies and what still requires skill. This is a stronger basis for trust than polished footage alone. The ecosystem of learning content can then support adoption. For me, the distinctive marketing opportunity is to sell creative confidence while being honest about the effort involved.</w:t>
       </w:r>
     </w:p>
     <w:p>
@@ -997,7 +1155,7 @@
         <w:t>中文记忆提纲：</w:t>
       </w:r>
       <w:r>
-        <w:t>Apple：定位、呈现、体验同向；Shot on iPhone用作品证明能力；生态留存。也承认价格与灵活性局限。</w:t>
+        <w:t>DJI突出：结果可见＋Pocket/Action不同场景；过程透明建立信任；教程帮助采纳。独特主张“创作信心”，同时诚实讲技能成本。</w:t>
       </w:r>
     </w:p>
     <w:p>
@@ -1021,12 +1179,12 @@
         <w:rPr>
           <w:b/>
         </w:rPr>
-        <w:t>English answer · 105 words</w:t>
-      </w:r>
-    </w:p>
-    <w:p>
-      <w:r>
-        <w:t>My favourite brand is Nike because it connects a useful product with an idea that feels personally motivating. Its message suggests that sport is not reserved for elite performers; making an effort is itself meaningful. That gives the brand emotional relevance across different levels of ability. I also admire how athlete stories can make this promise concrete, showing the discipline behind achievement rather than presenting success as effortless. Still, I would judge the brand through product quality and its actions, not inspiration alone. What attracts me is the combination of performance, identity, and encouragement, which offers more lasting meaning than a temporary discount or trend.</w:t>
+        <w:t>English · 107 words</w:t>
+      </w:r>
+    </w:p>
+    <w:p>
+      <w:r>
+        <w:t>The brand I would choose to discuss is lululemon because I find the relationship between movement, identity, and community interesting. Its appeal is not just the idea of looking athletic; it can connect clothing to practices that people want to sustain. Local ambassadors and movement activities provide a way to explore that promise beyond advertising. However, I would not confuse premium pricing with superior value for everyone. A community-led brand should also be judged by accessibility, product performance, and whether newcomers feel included. What I admire is the possibility of making a brand useful within a routine, rather than asking customers to express loyalty through purchasing alone.</w:t>
       </w:r>
     </w:p>
     <w:p>
@@ -1037,7 +1195,7 @@
         <w:t>中文记忆提纲：</w:t>
       </w:r>
       <w:r>
-        <w:t>Nike偏好口语版：性能＋身份＋鼓励；努力让普通人也能参与。此偏好须与你真实喜好一致，价值观仍需行动兑现。</w:t>
+        <w:t>个人偏好须真实：lululemon值得讨论的是运动/身份/社区；品牌嵌入习惯，不只靠购买表达忠诚。高价非普遍更好；看包容与性能。</w:t>
       </w:r>
     </w:p>
     <w:p>
@@ -1061,12 +1219,12 @@
         <w:rPr>
           <w:b/>
         </w:rPr>
-        <w:t>English answer · 103 words</w:t>
-      </w:r>
-    </w:p>
-    <w:p>
-      <w:r>
-        <w:t>Good marketing helps the right customer understand a valuable offer and makes the promise believable. Apple's Shot on iPhone is a memorable example because it turns a technical feature into an outcome people can see: compelling photographs and films. The customer becomes part of the demonstration, so the campaign connects product capability with creative identity. However, I would not assume every image represents effortless everyday results; production conditions and presentation still matter. For me, the lesson is to show value rather than simply describe superiority. Good marketing should support informed choice, deliver commercial results, and remain consistent with the customer's experience after purchase.</w:t>
+        <w:t>English · 105 words</w:t>
+      </w:r>
+    </w:p>
+    <w:p>
+      <w:r>
+        <w:t>Good marketing makes a relevant promise understandable, credible, and actionable. DJI product demonstrations are a useful example because they translate technical capabilities into visible footage. However, the strongest demonstration would not stop at the impressive result. It would show the context, the setup, and the skill required, helping viewers judge whether the product suits their own situation. This distinction matters because aspiration can attract interest while unrealistic expectations produce disappointment and returns. I would define good marketing as reducing uncertainty without removing informed choice. It should help suitable customers act confidently, create sustainable commercial value, and preserve trust when the real experience follows the advertisement.</w:t>
       </w:r>
     </w:p>
     <w:p>
@@ -1077,7 +1235,7 @@
         <w:t>中文记忆提纲：</w:t>
       </w:r>
       <w:r>
-        <w:t>好营销：对的人理解真实价值。Shot on iPhone把参数变作品；注意拍摄条件，不夸大日常效果；购买后体验需一致。</w:t>
+        <w:t>好营销＝承诺相关、可信、可行动。DJI演示从漂亮结果扩展到场景/设置/技能；减少不确定性，不制造不切实际期待和退货。</w:t>
       </w:r>
     </w:p>
     <w:p>
@@ -1101,12 +1259,12 @@
         <w:rPr>
           <w:b/>
         </w:rPr>
-        <w:t>English answer · 106 words</w:t>
-      </w:r>
-    </w:p>
-    <w:p>
-      <w:r>
-        <w:t>Loyalty programmes are popular because they give businesses a way to encourage repeat purchases and understand customer behaviour through direct relationships. Customers receive rewards, convenience, or a sense of recognition in return. Sephora's Beauty Insider is a useful example of combining membership benefits with a wider beauty shopping experience. However, I would not equate membership with genuine loyalty. People may join several programmes or buy only when discounts are available. The important question is whether the programme creates incremental retention and customer value after reward costs. I think it matters when it strengthens an already useful experience, rather than compensating for a weak product or service.</w:t>
+        <w:t>English · 107 words</w:t>
+      </w:r>
+    </w:p>
+    <w:p>
+      <w:r>
+        <w:t>Loyalty programmes are popular because they encourage repeat behaviour and create direct customer relationships. However, rewards do not automatically create loyalty. Lululemon offers a useful context for asking whether membership supports movement and a better brand experience, rather than simply more frequent purchasing. Membership formats and benefits vary by market, so I would check the local programme before describing specific perks. Strategically, I would distinguish reward-driven transactions from preference that survives without a discount. The programme should be evaluated through incremental retention, customer value, and its full cost. It matters when it reduces friction and recognises customers meaningfully, not when it makes a weak relationship look active.</w:t>
       </w:r>
     </w:p>
     <w:p>
@@ -1117,7 +1275,7 @@
         <w:t>中文记忆提纲：</w:t>
       </w:r>
       <w:r>
-        <w:t>Sephora会员：复购、直连数据、奖励认可；入会≠忠诚。算增量留存与奖励成本，不靠折扣掩盖体验差。</w:t>
+        <w:t>会员不等忠诚：lululemon按市场核实具体权益；问是否支持运动和体验。区分奖励交易vs无折扣仍偏好；增量留存、价值、全成本。</w:t>
       </w:r>
     </w:p>
     <w:p>
@@ -1141,12 +1299,12 @@
         <w:rPr>
           <w:b/>
         </w:rPr>
-        <w:t>English answer · 102 words</w:t>
-      </w:r>
-    </w:p>
-    <w:p>
-      <w:r>
-        <w:t>I agree that customers should be central to business decisions, but I would not interpret 'the customer is king' as meaning every request must be accepted. Customers deserve respect, transparency, and reliable service. However, a company also has responsibilities to employees, other customers, and its long-term sustainability. An unreasonable refund demand, for example, should be handled fairly rather than automatically approved. More importantly, customers may describe a solution without identifying the underlying need. A marketer's job is to investigate that need and design a workable response. I would support customer-centred decision-making with clear boundaries, rather than treating customer satisfaction as unconditional obedience.</w:t>
+        <w:t>English · 107 words</w:t>
+      </w:r>
+    </w:p>
+    <w:p>
+      <w:r>
+        <w:t>I support putting customers at the centre, but I would not interpret 'the customer is king' as unconditional agreement. Customers deserve respect and reliable value, while a business must also protect employees, fairness, and long-term sustainability. DJI provides a useful illustration: a customer may ask for every possible feature, but adding complexity could make the product worse for its intended users. The marketer should investigate the underlying job and explain trade-offs honestly. Sometimes the right answer is a different product or no purchase at all. Customer orientation means helping people make suitable choices, rather than treating every request as a command or every sale as a success.</w:t>
       </w:r>
     </w:p>
     <w:p>
@@ -1157,7 +1315,7 @@
         <w:t>中文记忆提纲：</w:t>
       </w:r>
       <w:r>
-        <w:t>顾客中心但非无条件服从；兼顾员工、公平、可持续性。区分顾客说的方案与背后的需求，退款例子说明边界。</w:t>
+        <w:t>顾客中心不无条件：DJI全功能需求可能破坏易用性；找任务、解释权衡，推荐不同产品甚至不买。顾客价值≠每次都成交。</w:t>
       </w:r>
     </w:p>
     <w:p>
@@ -1181,12 +1339,12 @@
         <w:rPr>
           <w:b/>
         </w:rPr>
-        <w:t>English answer · 105 words</w:t>
-      </w:r>
-    </w:p>
-    <w:p>
-      <w:r>
-        <w:t>Conflict between marketing and research and development often comes from different priorities and evidence standards. Marketing may focus on customer demand, competitive timing, and launch deadlines, while R&amp;D must consider technical feasibility, reliability, and long-term development. Both perspectives are valuable, but problems arise when teams exchange demands instead of explaining constraints. I would create a shared problem statement, involve both teams in customer research, and agree on trade-offs before development progresses too far. A prototype can then test whether a proposed feature is both useful and feasible. Shared outcome measures, such as adoption and satisfaction, help shift the discussion from departmental preferences to customer value.</w:t>
+        <w:t>English · 108 words</w:t>
+      </w:r>
+    </w:p>
+    <w:p>
+      <w:r>
+        <w:t>Marketing and R&amp;D can conflict because they frame uncertainty differently. Marketing may see a customer opportunity that needs a quick response, while R&amp;D sees reliability risks and technical trade-offs. In a DJI-style camera project, asking for better stabilisation without understanding size, power, or cost constraints creates unrealistic expectations. I would bring both teams around a shared customer task, such as recording a usable walking sequence, and agree on what success looks like. Prototypes can then test whether a technically feasible improvement changes the experience. The goal is not to make one department dominate; it is to turn customer desirability, technical feasibility, and commercial viability into a shared decision.</w:t>
       </w:r>
     </w:p>
     <w:p>
@@ -1197,7 +1355,7 @@
         <w:t>中文记忆提纲：</w:t>
       </w:r>
       <w:r>
-        <w:t>冲突源：上市与需求 vs 可行性与可靠性。共定义问题→一起研究→原型验证→提前权衡→共享采纳、满意度指标。</w:t>
+        <w:t>DJI式研发冲突：稳定性要求牵动体积/功耗/成本；共定拍摄任务与结果→原型→需求性/技术/商业三维决策。</w:t>
       </w:r>
     </w:p>
     <w:p>
@@ -1221,12 +1379,12 @@
         <w:rPr>
           <w:b/>
         </w:rPr>
-        <w:t>English answer · 104 words</w:t>
-      </w:r>
-    </w:p>
-    <w:p>
-      <w:r>
-        <w:t>Digital marketing has made marketing more interactive, measurable, and connected to the customer journey. Brands can reach specific audiences, observe responses, and adjust messages faster than with many traditional channels. Customers can also compare offers, publish reviews, and challenge claims, so communication is less controlled by the company. For a learning app, the journey can move directly from a social video to registration and product use. However, measurement is imperfect, and easy-to-track behaviour can distract from longer-term brand building. I see digital marketing as expanding the available methods, while the fundamental task remains understanding customers and delivering a credible reason to choose the brand.</w:t>
+        <w:t>English · 106 words</w:t>
+      </w:r>
+    </w:p>
+    <w:p>
+      <w:r>
+        <w:t>Digital marketing has changed the relationship between demonstration, evaluation, and purchase. DJI customers can watch footage, compare workflows, ask creators questions, and move towards purchase within a connected journey. This makes marketing more interactive and allows customers to scrutinise a promise before buying. However, visibility does not guarantee understanding: a short video may show a beautiful result without revealing the effort behind it. I would use digital channels to make both the outcome and the process easier to evaluate. Measurement should also continue beyond the click, including use, satisfaction, and returns. The most valuable change is reducing the distance between a claim and credible customer evidence.</w:t>
       </w:r>
     </w:p>
     <w:p>
@@ -1237,7 +1395,7 @@
         <w:t>中文记忆提纲：</w:t>
       </w:r>
       <w:r>
-        <w:t>数字化：互动、细分、测量、迭代；消费者更有话语权。视频→注册→使用；可测不等于重要，别忽视长期品牌。</w:t>
+        <w:t>数字改变：观看/比较/问答/购买连接；DJI结果与流程都可核查。短视频仍可能隐瞒努力；测到使用/满意/退货，缩短宣称与证据距离。</w:t>
       </w:r>
     </w:p>
     <w:p>
@@ -1261,12 +1419,12 @@
         <w:rPr>
           <w:b/>
         </w:rPr>
-        <w:t>English answer · 105 words</w:t>
-      </w:r>
-    </w:p>
-    <w:p>
-      <w:r>
-        <w:t>I see digital marketing as a shift in both opportunity and power. It allows smaller businesses to reach specialised audiences without buying mass-media coverage, and it creates faster feedback between customers and brands. At the same time, customers gain access to reviews, comparisons, and public channels for complaints. Duolingo shows how a brand can build cultural relevance through participation rather than broadcasting polished messages alone. However, dependence on platform algorithms makes attention unstable, and extensive targeting raises privacy concerns. My view is that digital marketing is most valuable when it builds a durable customer relationship, rather than making the business permanently dependent on rented attention.</w:t>
+        <w:t>English · 107 words</w:t>
+      </w:r>
+    </w:p>
+    <w:p>
+      <w:r>
+        <w:t>I see digital marketing as an opportunity to build evidence and relationships, but also a source of dependence. DJI can reach specialised creators through demonstrations and tutorials, while lululemon can connect online invitations with local participation. These approaches are valuable when they help customers act, rather than simply watch. However, platform algorithms can reward attention that has little commercial or personal value, and detailed targeting creates privacy responsibilities. I would therefore combine platform reach with useful owned resources and permission-based relationships. The strategic question is whether digital activity leaves the business with stronger customer understanding and trust, or merely a temporary audience that disappears when promotion stops.</w:t>
       </w:r>
     </w:p>
     <w:p>
@@ -1277,7 +1435,7 @@
         <w:t>中文记忆提纲：</w:t>
       </w:r>
       <w:r>
-        <w:t>机会与权力变化：小企业可精准触达，消费者可评价发声。Duolingo参与文化；风险为算法依赖、隐私和“租来的流量”。</w:t>
+        <w:t>数字价值＝证据＋关系；DJI教程、lululemon线上邀请接线下。警惕算法、隐私、临时观众；积累自有资源和许可关系。</w:t>
       </w:r>
     </w:p>
     <w:p>
@@ -1301,12 +1459,12 @@
         <w:rPr>
           <w:b/>
         </w:rPr>
-        <w:t>English answer · 104 words</w:t>
-      </w:r>
-    </w:p>
-    <w:p>
-      <w:r>
-        <w:t>If I had to choose one major marketing innovation of the past twenty years, I would choose the combination of smartphones and social platforms. It made communication continuous, location-independent, and participatory. Customers became reviewers, creators, and distributors of brand messages, while businesses gained new ways to connect content with transactions. Duolingo's social personality would be difficult to reproduce through television advertising alone because much of its appeal comes from interaction and cultural timing. However, this innovation also introduced misinformation, attention fatigue, and platform dependence. Its significance is not simply better targeting; it changed who creates marketing meaning and how quickly that meaning can evolve.</w:t>
+        <w:t>English · 108 words</w:t>
+      </w:r>
+    </w:p>
+    <w:p>
+      <w:r>
+        <w:t>I would choose the rise of mobile, participatory media as a major marketing innovation of the past twenty years. It changed customers from an audience into people who demonstrate, interpret, and challenge brand promises. For DJI, creator footage can make product value visible in situations a central advertising team could never fully represent. For lululemon, participants can connect a community experience to their own movement story. However, customer-created content is not automatically authentic, representative, or unpaid. Its significance is that marketing meaning is now negotiated more publicly. Brands need to support credible experiences and transparent relationships, rather than assume they can control every interpretation through polished communication alone.</w:t>
       </w:r>
     </w:p>
     <w:p>
@@ -1317,7 +1475,7 @@
         <w:t>中文记忆提纲：</w:t>
       </w:r>
       <w:r>
-        <w:t>20年创新：智能手机＋社交平台。顾客变创作者、传播者；Duolingo靠互动与时机。改变意义共创，同时带来疲劳和平台依赖。</w:t>
+        <w:t>20年创新：移动参与式媒介，顾客能展示解释质疑。DJI用户作品、lululemon参与故事；UGC不自动真实/代表/无偿，关系要透明。</w:t>
       </w:r>
     </w:p>
     <w:p>
@@ -1341,12 +1499,12 @@
         <w:rPr>
           <w:b/>
         </w:rPr>
-        <w:t>English answer · 104 words</w:t>
-      </w:r>
-    </w:p>
-    <w:p>
-      <w:r>
-        <w:t>I am interested in the development of AI-assisted research and content tools. They can help marketers summarise large volumes of feedback, explore alternative messages, and produce initial creative drafts more quickly. For example, a learning app could use them to identify recurring frustrations in support conversations, then validate those patterns through interviews. However, I would not treat generated insights as verified facts. The underlying data may be biased, and generated content can be inaccurate or too similar to competitors' work. I would use AI to expand and accelerate the exploration process, while keeping human responsibility for interpretation, privacy, originality, and the final marketing decision.</w:t>
+        <w:t>English · 105 words</w:t>
+      </w:r>
+    </w:p>
+    <w:p>
+      <w:r>
+        <w:t>I am interested in AI tools that help marketers analyse customer friction, not just produce more content. For DJI, an AI-assisted analysis could organise questions about carrying, operating, and editing into patterns that a team investigates. For lululemon, it could help identify repeated barriers to attending community activities. However, those patterns remain hypotheses: language models can misinterpret context, and the available feedback may exclude less vocal customers. I would validate findings through interviews and behaviour, protect personal information, and keep humans responsible for decisions. The innovative use of AI is not replacing customer understanding; it is creating more time and sharper questions for genuine investigation.</w:t>
       </w:r>
     </w:p>
     <w:p>
@@ -1357,7 +1515,7 @@
         <w:t>中文记忆提纲：</w:t>
       </w:r>
       <w:r>
-        <w:t>AI工具：归纳反馈、探索文案、初稿提效。客服反馈找模式→访谈验证；人负责准确、隐私、原创与最终决策。</w:t>
+        <w:t>AI用于分析阻碍而非堆内容：DJI携带操作剪辑、lululemon参加障碍→模式是假设→访谈行为验证。照顾沉默人群、隐私和人工责任。</w:t>
       </w:r>
     </w:p>
     <w:p>
@@ -1381,12 +1539,12 @@
         <w:rPr>
           <w:b/>
         </w:rPr>
-        <w:t>English answer · 106 words</w:t>
-      </w:r>
-    </w:p>
-    <w:p>
-      <w:r>
-        <w:t>To discover untapped customer needs, I would begin with observation and exploratory interviews rather than a large survey. Surveys are useful for measuring known questions, but people may struggle to describe needs they have not recognised. I would observe how customers complete a task, including workarounds, frustrations, and moments when they give up. For a learning app, this might reveal that learners need confidence and manageable routines more than additional content. I would then turn the findings into hypotheses, test simple prototypes, and use a survey to estimate how widespread the need is. The sequence matters: discover the problem before measuring demand for a proposed solution.</w:t>
+        <w:t>English · 108 words</w:t>
+      </w:r>
+    </w:p>
+    <w:p>
+      <w:r>
+        <w:t>To discover untapped needs, I would observe people trying to complete a task before asking which product they want. For DJI, I would study moments when someone wanted to film but decided not to: perhaps the equipment was inconvenient, the setting felt awkward, or editing seemed overwhelming. These abandoned intentions can reveal demand that product reviews miss. I would include phone-only users and people who returned a camera, not just enthusiasts. Then I would build a simple prototype or support intervention and observe whether behaviour changes. A need is commercially meaningful when solving it produces actual use or willingness to pay, rather than enthusiastic agreement in an interview.</w:t>
       </w:r>
     </w:p>
     <w:p>
@@ -1397,7 +1555,7 @@
         <w:t>中文记忆提纲：</w:t>
       </w:r>
       <w:r>
-        <w:t>未开发需求共用法：观察＋探索访谈→隐性痛点/替代办法→假设→原型→问卷量化。先发现问题，后测方案需求。</w:t>
+        <w:t>未开发需求看“想拍却没拍”的放弃时刻；纳入手机用户和退货者→原型/支持干预→真实使用付费。赞同不等需求。</w:t>
       </w:r>
     </w:p>
     <w:p>
@@ -1421,12 +1579,12 @@
         <w:rPr>
           <w:b/>
         </w:rPr>
-        <w:t>English answer · 106 words</w:t>
-      </w:r>
-    </w:p>
-    <w:p>
-      <w:r>
-        <w:t>Brexit has affected UK businesses through changes in trading arrangements, labour mobility, and regulatory requirements. Firms trading goods with the EU may face additional customs procedures and compliance costs, while some sectors have experienced recruitment challenges. The impact is uneven: a domestic service business faces different issues from a company with a cross-border supply chain. From a marketing perspective, these changes can influence prices, product availability, and the credibility of delivery promises. I would avoid treating Brexit as the sole explanation for every difficulty, because inflation and other external shocks also matter. Businesses need to assess their particular exposure before adjusting their positioning or market priorities.</w:t>
+        <w:t>English · 107 words</w:t>
+      </w:r>
+    </w:p>
+    <w:p>
+      <w:r>
+        <w:t>Brexit affects UK businesses through changes in trade procedures, regulation, and labour mobility, but the impact depends on the firm's activities. A retailer importing technical apparel faces different exposure from a locally delivered movement service. Additional administration or supply-chain complexity can influence availability, costs, and delivery promises. For marketing, I would examine how these changes affect the customer's experience before altering messages or prices. A premium promise becomes less credible if reliable delivery is missing. I would also separate Brexit-related effects from inflation and other shocks. The useful response is a specific exposure analysis, not treating Brexit as a universal explanation for every change in business performance.</w:t>
       </w:r>
     </w:p>
     <w:p>
@@ -1437,7 +1595,7 @@
         <w:t>中文记忆提纲：</w:t>
       </w:r>
       <w:r>
-        <w:t>Brexit机制：通关、合规、劳动力→成本/价格/供应/交付承诺；行业不同，不能把通胀等所有问题归因于脱欧。</w:t>
+        <w:t>Brexit：贸易/监管/劳动力；进口服装与本地运动服务不同。供应成本交付影响承诺；区分通胀等因素，不泛化归因。</w:t>
       </w:r>
     </w:p>
     <w:p>
@@ -1461,12 +1619,12 @@
         <w:rPr>
           <w:b/>
         </w:rPr>
-        <w:t>English answer · 106 words</w:t>
-      </w:r>
-    </w:p>
-    <w:p>
-      <w:r>
-        <w:t>After Brexit, some UK businesses may find opportunities by diversifying export markets, improving local supply chains, or serving customers whose needs have changed. For example, a firm with strong local production could emphasise reliable delivery when cross-border sourcing becomes more complicated. Trade agreements outside the EU may create possibilities, but opportunities depend on the sector and the actual agreement; they are not automatic benefits. I would compare market demand, compliance costs, logistics, and competitive intensity before entering a new market. From a marketing perspective, the strongest opportunity is often a more relevant value proposition, not simply using British identity as a slogan without supporting customer value.</w:t>
+        <w:t>English · 106 words</w:t>
+      </w:r>
+    </w:p>
+    <w:p>
+      <w:r>
+        <w:t>After Brexit, opportunities may arise from serving customers whose priorities or supply options have changed. UK businesses could diversify export markets, strengthen local fulfilment, or develop services less dependent on cross-border goods movement. A movement business inspired by lululemon might build value through local instruction and community relationships, although apparel sourcing still requires separate analysis. I would not describe these possibilities as automatic Brexit benefits. New trade arrangements can help some sectors while adding costs elsewhere. The marketing task is to identify a specific unmet need, assess the economics, and build a credible proposition. Geographic identity alone is weaker than demonstrable reliability, relevance, or customer support.</w:t>
       </w:r>
     </w:p>
     <w:p>
@@ -1477,7 +1635,7 @@
         <w:t>中文记忆提纲：</w:t>
       </w:r>
       <w:r>
-        <w:t>机会：出口多元化、本地供应、可靠交付；贸易协议须看具体行业。先算需求、合规、物流、竞争，不把英国身份当万能卖点。</w:t>
+        <w:t>机会是条件性的：出口多元化、本地履约/服务；lululemon启发的本地运动关系不能抵消服装进口问题。具体需求＋经济性，非英国身份口号。</w:t>
       </w:r>
     </w:p>
     <w:p>
@@ -1501,12 +1659,12 @@
         <w:rPr>
           <w:b/>
         </w:rPr>
-        <w:t>English answer · 104 words</w:t>
-      </w:r>
-    </w:p>
-    <w:p>
-      <w:r>
-        <w:t>Companies now reach customers through a more connected mix of channels, including search, social platforms, apps, email, retail, and customer communities. The difference is not just that more channels exist; customers move between them and expect a consistent experience. Someone might discover a Nike product through a creator, compare reviews on a phone, and purchase in a store. Businesses therefore need to coordinate messages, availability, and service across the journey. Customers also influence communication through their own content and feedback. I would prioritise channels according to customer behaviour, rather than assuming a digital presence everywhere is necessary or that traditional channels have become irrelevant.</w:t>
+        <w:t>English · 108 words</w:t>
+      </w:r>
+    </w:p>
+    <w:p>
+      <w:r>
+        <w:t>Companies now reach customers through connected experiences rather than a simple sequence of advertisements. A DJI customer might discover footage through a creator, research tutorials, compare use cases, and then seek a demonstration. A lululemon customer might encounter an online invitation before attending a local movement activity. The important difference is that communication can lead directly into participation and evaluation. Customers also contribute their own interpretations, so the brand cannot fully control the message. I would design channel roles around the customer's next uncertainty, ensuring continuity across content, product information, and service. Being present everywhere matters less than being useful at the moments that influence a real decision.</w:t>
       </w:r>
     </w:p>
     <w:p>
@@ -1517,7 +1675,7 @@
         <w:t>中文记忆提纲：</w:t>
       </w:r>
       <w:r>
-        <w:t>触达变化＝多渠道连接＋顾客共创。Nike发现→评价→门店；信息、库存、服务一致，按行为选渠道，不必处处开账号。</w:t>
+        <w:t>触达＝连接体验；DJI作品→教程→试用，lululemon邀请→运动。按下一疑问分配渠道；关键时刻有用胜过处处出现。</w:t>
       </w:r>
     </w:p>
     <w:p>
@@ -1541,12 +1699,12 @@
         <w:rPr>
           <w:b/>
         </w:rPr>
-        <w:t>English answer · 106 words</w:t>
-      </w:r>
-    </w:p>
-    <w:p>
-      <w:r>
-        <w:t>I would stay informed through a regular process rather than occasional browsing. Each week, I would review reliable industry publications, platform updates, and a small set of competitors. Each month, I would compare those signals with customer feedback and performance data. I would also learn from academic research, because it can challenge assumptions that become popular in industry discussions. The final step is applying the information: selecting one relevant hypothesis to test and recording what we learn. This prevents information gathering from becoming trend collecting. My goal would be to understand what is changing, why it matters for our customers, and whether the business should respond.</w:t>
+        <w:t>English · 110 words</w:t>
+      </w:r>
+    </w:p>
+    <w:p>
+      <w:r>
+        <w:t>I would use a regular learning system rather than an endless stream of marketing news. Each week, I would review platform updates, credible industry analysis, and changes in customer conversations. Each month, I would connect those signals to a business question. For DJI, that might be whether creators increasingly prioritise workflow simplicity over isolated specifications. For lululemon, it might be whether community formats welcome different experience levels. I would record the evidence, the hypothesis, and what would change my mind, then test selectively. This turns staying informed into decision-making capability. The goal is not to know every trend, but to recognise which change matters for a particular customer and proposition.</w:t>
       </w:r>
     </w:p>
     <w:p>
@@ -1557,7 +1715,7 @@
         <w:t>中文记忆提纲：</w:t>
       </w:r>
       <w:r>
-        <w:t>信息节奏：每周行业/平台/竞品；每月反馈与数据；学术研究校正偏见。最终形成一个可测假设，而非囤热点。</w:t>
+        <w:t>定期学习系统：周看信号，月接业务问题；DJI流程vs参数、lululemon不同水平；记证据/假设/反证，筛选实验，不囤资讯。</w:t>
       </w:r>
     </w:p>
     <w:p>
@@ -1581,12 +1739,12 @@
         <w:rPr>
           <w:b/>
         </w:rPr>
-        <w:t>English answer · 104 words</w:t>
-      </w:r>
-    </w:p>
-    <w:p>
-      <w:r>
-        <w:t>A good marketer needs curiosity, empathy, analytical judgement, and the ability to communicate clearly. Curiosity helps identify questions others overlook, while empathy helps understand the customer's context without assuming everyone thinks like the marketer. Analytical judgement is needed to distinguish useful evidence from attractive but misleading numbers. Communication matters because marketing decisions require cooperation with product, finance, and sales teams. I would also add ethical responsibility: influencing behaviour should not mean exploiting confusion or vulnerability. For example, promoting a learning app requires balancing persuasive reminders with respect for users' time. The strongest marketers combine commercial ambition with the discipline to question their own assumptions.</w:t>
+        <w:t>English · 107 words</w:t>
+      </w:r>
+    </w:p>
+    <w:p>
+      <w:r>
+        <w:t>A strong marketer needs empathy, analytical judgement, and the confidence to challenge an attractive but weak idea. Empathy helps identify the customer's actual barrier; analysis tests whether an intervention changes behaviour; communication brings other teams into the decision. For DJI, this could mean questioning whether a beautiful video convinces beginners they can achieve the result. For lululemon, it could mean asking whether an event makes newcomers comfortable, not just whether existing fans enjoy it. I would also emphasise integrity: commercial ambition should not justify misleading demonstrations or manufactured belonging. The best marketers connect creativity with evidence and remain willing to discover that their preferred interpretation was wrong.</w:t>
       </w:r>
     </w:p>
     <w:p>
@@ -1597,7 +1755,7 @@
         <w:t>中文记忆提纲：</w:t>
       </w:r>
       <w:r>
-        <w:t>好营销人：好奇、共情、判断、沟通、伦理。学习App提醒要尊重时间；商业进取＋敢质疑自身假设。</w:t>
+        <w:t>品质：共情/分析/沟通/质疑/诚信；DJI漂亮片能否建立新手信心？lululemon新人舒适吗？创新须接受证据推翻。</w:t>
       </w:r>
     </w:p>
     <w:p>
@@ -1621,12 +1779,12 @@
         <w:rPr>
           <w:b/>
         </w:rPr>
-        <w:t>English answer · 105 words</w:t>
-      </w:r>
-    </w:p>
-    <w:p>
-      <w:r>
-        <w:t>A logo change can signal renewal, improve recognition across digital screens, or support a change in positioning. However, it can also weaken familiar associations and create confusion if customers do not understand the reason. I would first ask what problem the existing identity creates and whether changing the logo is the most effective response. Then I would test recognition, distinctiveness, and fit with the brand's intended meaning, including accessibility across different formats. Implementation costs also matter, from packaging to signage. Ultimately, a new logo cannot repair a poor customer experience. It is valuable when it expresses a meaningful change that the business can actually deliver.</w:t>
+        <w:t>English · 110 words</w:t>
+      </w:r>
+    </w:p>
+    <w:p>
+      <w:r>
+        <w:t>A logo change can improve recognition in new contexts or signal a positioning shift, but it can also discard valuable familiarity. For a brand such as lululemon, I would ask whether customers' real confusion comes from the visual identity or from an overly narrow perception of the activities it serves. If the problem is meaning, changing the symbol may be less effective than demonstrating broader participation. I would test recognition, distinctive associations, accessibility, and implementation costs before a rollout. The logo is one cue within a larger experience. A successful change makes the promise easier to recognise; it does not substitute for product performance or the way customers are treated.</w:t>
       </w:r>
     </w:p>
     <w:p>
@@ -1637,7 +1795,7 @@
         <w:t>中文记忆提纲：</w:t>
       </w:r>
       <w:r>
-        <w:t>换logo：更新、数字适配 vs 识别损失、困惑；先问问题→测识别/差异/定位/可访问性→算落地成本。换标救不了差体验。</w:t>
+        <w:t>换logo先诊断：lululemon问题若是“只做瑜伽”的印象，拓展体验或比换标更有效。测识别/联想/可访问/成本；视觉不能替代交付。</w:t>
       </w:r>
     </w:p>
     <w:p>
@@ -1661,12 +1819,12 @@
         <w:rPr>
           <w:b/>
         </w:rPr>
-        <w:t>English answer · 103 words</w:t>
-      </w:r>
-    </w:p>
-    <w:p>
-      <w:r>
-        <w:t>For Apple, I would identify brand strength, ecosystem integration, and customer loyalty as major strengths. Weaknesses include premium pricing and the limited flexibility some customers associate with a tightly controlled ecosystem. Opportunities could include services growth, accessibility improvements, and useful new applications of technology that deepen customer value. Threats include intense competition, regulatory scrutiny, and supply-chain disruption. However, SWOT is only a starting point: a list becomes useful when it informs choices. For example, Apple should deepen ecosystem benefits without making customers feel trapped. I would assess each factor using a specific market and product category, because Apple's position is not identical everywhere.</w:t>
+        <w:t>English · 107 words</w:t>
+      </w:r>
+    </w:p>
+    <w:p>
+      <w:r>
+        <w:t>For DJI's consumer cameras, strengths include technical capabilities and visibly demonstrable results. Weaknesses include the extra carrying, learning, and editing effort compared with using a phone. Opportunities lie in helping more customers capture meaningful everyday and outdoor experiences, particularly through simpler workflows and relevant education. Threats include improving smartphone cameras, competing devices, and market-specific regulatory or reputational uncertainty. I would distinguish consumer cameras from drones rather than transfer every drone-related risk automatically. The strategic implication is to compete on useful creative outcomes, not specifications alone. DJI should demonstrate when a dedicated device meaningfully improves the experience and remain clear about when the customer's existing phone is sufficient.</w:t>
       </w:r>
     </w:p>
     <w:p>
@@ -1677,7 +1835,7 @@
         <w:t>中文记忆提纲：</w:t>
       </w:r>
       <w:r>
-        <w:t>Apple SWOT：S品牌/生态/忠诚；W高价/灵活性；O服务/可访问性/技术应用；T竞争/监管/供应。清单必须导向战略选择。</w:t>
+        <w:t>DJI相机SWOT：S技术/效果可见；W携带学习剪辑；O流程简化/场景教育；T手机进步/竞品/分市场风险。无人机风险不全套用相机。</w:t>
       </w:r>
     </w:p>
     <w:p>
@@ -1701,12 +1859,12 @@
         <w:rPr>
           <w:b/>
         </w:rPr>
-        <w:t>English answer · 109 words</w:t>
-      </w:r>
-    </w:p>
-    <w:p>
-      <w:r>
-        <w:t>I view new media as an environment where brands participate in conversations rather than simply purchase an audience. Short videos, creator communities, and interactive formats can make communication more immediate and relatable. Duolingo demonstrates how a distinctive voice can earn attention through humour and cultural participation. However, new media also rewards speed and emotional reactions, which can encourage shallow messages or unnecessary controversy. I would select formats according to the customer's needs and the brand's credibility. A serious financial service, for example, should not copy an entertainment brand's tone automatically. The opportunity is more meaningful engagement; the challenge is maintaining consistency and trust under constant pressure to be visible.</w:t>
+        <w:t>English · 109 words</w:t>
+      </w:r>
+    </w:p>
+    <w:p>
+      <w:r>
+        <w:t>New media is valuable when it allows customers to inspect and participate in a brand's promise. DJI can use short videos to demonstrate a filming result, but longer tutorials may be necessary to explain the workflow. Lululemon can use social content to invite participation, but the experience itself determines whether people return. I would therefore resist treating one format as universally effective. Short-form content can attract attention while removing important context, and algorithmic visibility can reward exaggerated claims. The strongest approach gives each format a clear role: inspiration, explanation, reassurance, or participation. Novelty matters less than helping the customer move from interest to an informed and useful next step.</w:t>
       </w:r>
     </w:p>
     <w:p>
@@ -1717,7 +1875,7 @@
         <w:t>中文记忆提纲：</w:t>
       </w:r>
       <w:r>
-        <w:t>新媒体＝参与对话；Duolingo幽默赚注意力。风险：快、情绪化、争议；按需求与可信度选形式，金融品牌别硬抄娱乐语气。</w:t>
+        <w:t>新媒体按角色：启发/解释/安心/参与。DJI短片吸引、长教程解释；lululemon邀请后体验决定复返。算法爆款可能缺上下文。</w:t>
       </w:r>
     </w:p>
     <w:p>
@@ -1741,12 +1899,12 @@
         <w:rPr>
           <w:b/>
         </w:rPr>
-        <w:t>English answer · 105 words</w:t>
-      </w:r>
-    </w:p>
-    <w:p>
-      <w:r>
-        <w:t>B2B and B2C marketing differ mainly in the buying context, not because one is rational and the other emotional. B2B purchases often involve multiple decision-makers, longer evaluation periods, and greater attention to integration, risk, and financial outcomes. B2C purchases may involve fewer participants and shorter journeys, although expensive consumer products can still require extensive research. For example, selling learning software to a university requires evidence for procurement staff, teachers, and users, while selling an app subscription to an individual emphasises personal goals and convenience. Both require trust and clear value. I would map the decision process before choosing content, channels, and the appropriate relationship-building approach.</w:t>
+        <w:t>English · 107 words</w:t>
+      </w:r>
+    </w:p>
+    <w:p>
+      <w:r>
+        <w:t>B2B and B2C marketing differ mainly in the buying process and consequences of the decision. Selling DJI equipment to a production organisation may involve users, procurement staff, and budget owners who assess workflow fit, support, and reliability. Selling a Pocket camera to an individual may focus on personal creativity, convenience, and affordability. However, the consumer decision can still be highly considered, while business buyers also care about confidence and reputation. I would map the stakeholders, risks, and evidence required rather than assume B2B is rational and B2C emotional. The message should address the decision context, including what successful use looks like after the purchase has been approved.</w:t>
       </w:r>
     </w:p>
     <w:p>
@@ -1757,7 +1915,7 @@
         <w:t>中文记忆提纲：</w:t>
       </w:r>
       <w:r>
-        <w:t>B2B/B2C：决策情境不同，非理性/感性二分。大学采购多人、周期、风险；个人订阅目标、便捷。都要信任和价值。</w:t>
+        <w:t>B2B/B2C用DJI同产品类：机构多方审批/流程/支持/可靠性；个人创作/便捷/负担。非理性vs感性二分；看成功使用条件。</w:t>
       </w:r>
     </w:p>
     <w:p>
@@ -1781,12 +1939,12 @@
         <w:rPr>
           <w:b/>
         </w:rPr>
-        <w:t>English answer · 105 words</w:t>
-      </w:r>
-    </w:p>
-    <w:p>
-      <w:r>
-        <w:t>I would interpret market structures as the economic conditions shaping competition. The main categories are perfect competition, monopolistic competition, oligopoly, and monopoly, distinguished by the number of firms, product differentiation, and barriers to entry. Many consumer brands operate in differentiated markets, while some industries have only a few powerful competitors. These structures affect pricing power and the importance of branding. For example, smartphone competition involves substantial entry barriers and strong differentiation. However, conclusions depend on how the market is defined geographically and by product. Understanding structure helps a marketer judge whether growth should come from differentiation, efficiency, innovation, or changing the competitive frame customers use.</w:t>
+        <w:t>English · 108 words</w:t>
+      </w:r>
+    </w:p>
+    <w:p>
+      <w:r>
+        <w:t>Market structures describe how competition is organised, including the number of firms, differentiation, and barriers to entry. The standard categories are perfect competition, monopolistic competition, oligopoly, and monopoly. For DJI consumer cameras, technical development and customer familiarity can create entry barriers, but market boundaries matter: including smartphones changes the competitive picture considerably. For lululemon, many alternatives exist, so distinctive meaning and product experience are important sources of preference. I would avoid assigning a structure from brand visibility alone without market evidence. Understanding structure helps identify where advantage comes from, whether through cost, technical capability, differentiation, or redefining the alternatives customers consider when deciding how to solve their problem.</w:t>
       </w:r>
     </w:p>
     <w:p>
@@ -1797,7 +1955,7 @@
         <w:t>中文记忆提纲：</w:t>
       </w:r>
       <w:r>
-        <w:t>【按市场结构理解】完全竞争、垄断竞争、寡头、垄断；企业数/差异/壁垒→定价与品牌。先界定地域和产品市场。</w:t>
+        <w:t>市场结构四类＋企业数/差异/壁垒；DJI若纳入手机，竞争边界改变；lululemon替代多。不能凭品牌知名度判断垄断。</w:t>
       </w:r>
     </w:p>
     <w:p>
@@ -1821,12 +1979,12 @@
         <w:rPr>
           <w:b/>
         </w:rPr>
-        <w:t>English answer · 107 words</w:t>
-      </w:r>
-    </w:p>
-    <w:p>
-      <w:r>
-        <w:t>Digital tools have made consumers more informed, connected, and accustomed to convenience. Search and reviews reduce the effort required to compare products, while recommendations help people discover options they might not seek independently. Social platforms also turn purchasing into a visible expression of identity. However, this does not mean consumers always make better decisions: recommendation systems, urgency messages, and information overload can shape choices in less helpful ways. For a learning app, reminders may support a useful habit, but excessive notifications can create frustration. I would design digital marketing around informed choice and genuine value, rather than assuming every increase in clicks represents an improvement for consumers.</w:t>
+        <w:t>English · 109 words</w:t>
+      </w:r>
+    </w:p>
+    <w:p>
+      <w:r>
+        <w:t>Digital tools have changed consumer behaviour by making comparison, imitation, and public evaluation easier. A DJI buyer can watch footage from multiple creators and imagine using the camera, while a lululemon customer can discover movement routines through people they follow. This can reduce uncertainty, but it can also create unrealistic expectations or social pressure. A polished demonstration may hide the effort required, and an aspirational community image may make a beginner feel excluded. I would use digital marketing to increase informed confidence, not simply urgency. Behavioural change is valuable when customers choose more appropriately and use the product meaningfully, rather than when persuasion produces additional clicks or regretful purchases.</w:t>
       </w:r>
     </w:p>
     <w:p>
@@ -1837,7 +1995,7 @@
         <w:t>中文记忆提纲：</w:t>
       </w:r>
       <w:r>
-        <w:t>行为：比较更方便、推荐促发现、消费表达身份；但算法/紧迫感/过载可误导。提醒助习惯，过多则扰民；点击不是福利。</w:t>
+        <w:t>行为：比较/模仿/公开评价；DJI复现期待、lululemon社交归属。也会不切实际/排斥/压力；提升知情信心，不只制造紧迫感。</w:t>
       </w:r>
     </w:p>
     <w:p>
@@ -1861,12 +2019,12 @@
         <w:rPr>
           <w:b/>
         </w:rPr>
-        <w:t>English answer · 108 words</w:t>
-      </w:r>
-    </w:p>
-    <w:p>
-      <w:r>
-        <w:t>Digital space changes marketing by making the boundary between communication and consumption less clear. A person can discover a product, evaluate it, purchase it, and share the experience within connected platforms. This creates opportunities to reduce friction and personalise useful information. It also means marketing depends more heavily on product experience, because customers can publicly expose gaps between a promise and reality. Duolingo illustrates this connection between a recognisable product identity and social participation. However, marketers must manage privacy and platform dependence. I would therefore combine digital reach with owned relationships, such as permission-based email or customer communities, so the brand's connection is more durable than algorithmic visibility.</w:t>
+        <w:t>English · 109 words</w:t>
+      </w:r>
+    </w:p>
+    <w:p>
+      <w:r>
+        <w:t>Digital space makes marketing more continuous: customers can discover, question, experience, and discuss a proposition across connected touchpoints. For DJI, the opportunity is linking impressive footage to practical guidance and product evaluation. For lululemon, it is linking a digital invitation to a local experience and an ongoing relationship. This means communication should be designed around the next action, not treated as an isolated piece of content. However, platform dependency and privacy concerns limit what brands should track and control. I would build useful owned resources and permission-based follow-up, so digital attention develops into trust and learning. The objective is a coherent journey, rather than presence across every available platform.</w:t>
       </w:r>
     </w:p>
     <w:p>
@@ -1877,7 +2035,7 @@
         <w:t>中文记忆提纲：</w:t>
       </w:r>
       <w:r>
-        <w:t>数字空间把发现、评价、购买、分享连起来；传播与体验难分。Duolingo产品人格＋社媒；自有关系与许可邮件降低算法依赖。</w:t>
+        <w:t>数字空间持续旅程：DJI作品→指导→评价；lululemon邀请→线下→关系。内容服务下一行动；自有资源与许可跟进，兼顾隐私。</w:t>
       </w:r>
     </w:p>
     <w:p>
@@ -1901,12 +2059,12 @@
         <w:rPr>
           <w:b/>
         </w:rPr>
-        <w:t>English answer · 106 words</w:t>
-      </w:r>
-    </w:p>
-    <w:p>
-      <w:r>
-        <w:t>A strong marketing proposal should explain a logical chain: the business problem, the customer insight, the strategic choice, and the actions that follow. I would include a specific target audience, a differentiated value proposition, channel roles, budget, timing, and clear responsibilities. Measurement should connect activity to outcomes, rather than simply count impressions or posts. For a learning app, useful content might attract potential users, while onboarding messages help convert interest into regular practice. I would also include risks and a testing plan. The most important quality is coherence: each element should support the same objective, with enough flexibility to respond when the evidence challenges our assumptions.</w:t>
+        <w:t>English · 110 words</w:t>
+      </w:r>
+    </w:p>
+    <w:p>
+      <w:r>
+        <w:t>A marketing proposal should make its reasoning visible: the customer problem, the behavioural objective, the chosen proposition, and the actions expected to change behaviour. For DJI, a proposal might address beginners who admire camera footage but doubt their ability to reproduce it. The message, tutorial content, demonstration, and follow-up would all respond to that barrier. I would specify channel roles, budget, responsibilities, timing, and measures such as qualified consideration and satisfaction after purchase. I would also state what could invalidate the proposal. This is important because a polished presentation can hide weak assumptions. A strong proposal is coherent enough to execute and explicit enough to learn from when results disappoint.</w:t>
       </w:r>
     </w:p>
     <w:p>
@@ -1917,7 +2075,7 @@
         <w:t>中文记忆提纲：</w:t>
       </w:r>
       <w:r>
-        <w:t>方案逻辑：商业问题→洞察→战略→行动；人群/价值/渠道/预算/时间/责任/指标。加入风险测试，所有环节同向。</w:t>
+        <w:t>方案DJI实例：欣赏片却没信心复现→内容/演示/跟进同向；明确渠道/预算/责任/时间/质量指标/反证条件。漂亮PPT不能掩盖弱假设。</w:t>
       </w:r>
     </w:p>
     <w:p>
@@ -1941,12 +2099,12 @@
         <w:rPr>
           <w:b/>
         </w:rPr>
-        <w:t>English answer · 107 words</w:t>
-      </w:r>
-    </w:p>
-    <w:p>
-      <w:r>
-        <w:t>Emerging marketing tools can change how the marketing mix is delivered, but they should not replace its underlying logic. AI can support content exploration and service personalisation; social commerce connects promotion with purchasing; customer data tools can coordinate experiences across channels. For a learning app, digital delivery enables frequent product updates, subscription pricing, app-based distribution, and interactive promotion. That changes all four Ps: product, price, place, and promotion. However, personalisation requires responsible data use, and easy distribution can intensify competition. I would assess a new tool by whether it improves customer value and the consistency of the mix, rather than treating technical novelty as a strategy itself.</w:t>
+        <w:t>English · 109 words</w:t>
+      </w:r>
+    </w:p>
+    <w:p>
+      <w:r>
+        <w:t>Emerging tools can improve the marketing mix when they reduce a specific customer barrier. For DJI, interactive guidance could help explain product differences, while AI-assisted support might organise recurring workflow questions for human review. These are possible applications, not claims about current features. The four Ps still need to work together: the product must deliver useful footage, pricing must reflect perceived value, distribution must support evaluation, and promotion must set realistic expectations. Digital tools can connect these decisions, but excessive automation can make an experience impersonal or misleading. I would judge innovation by better decisions and easier adoption, rather than the volume of personalised content a system can generate.</w:t>
       </w:r>
     </w:p>
     <w:p>
@@ -1957,7 +2115,7 @@
         <w:t>中文记忆提纲：</w:t>
       </w:r>
       <w:r>
-        <w:t>工具＋4P：AI/社交商务/数据；产品迭代、订阅价、App渠道、互动推广。新技术须让组合更一致，兼顾隐私与竞争。</w:t>
+        <w:t>新工具服务4P：DJI互动选型/AI问题整理属建议；产品/价值定价/可评价渠道/现实推广需一致。创新看采纳与判断，不看生成量。</w:t>
       </w:r>
     </w:p>
     <w:p>
@@ -1981,12 +2139,12 @@
         <w:rPr>
           <w:b/>
         </w:rPr>
-        <w:t>English answer · 107 words</w:t>
-      </w:r>
-    </w:p>
-    <w:p>
-      <w:r>
-        <w:t>To persuade investors to support a start-up, I would build an evidence-based investment case rather than rely on an exciting idea. I would explain the customer problem, why existing alternatives are inadequate, and what makes our solution defensible. Then I would show early evidence of demand, such as paid trials or repeat usage, alongside the economics of acquiring and serving customers. For a learning app, registrations alone would not establish product-market fit; retention and willingness to pay matter more. I would explain how the requested funding supports specific milestones and acknowledge major risks. Investors should understand both the potential return and the assumptions that could prevent it.</w:t>
+        <w:t>English · 109 words</w:t>
+      </w:r>
+    </w:p>
+    <w:p>
+      <w:r>
+        <w:t>I would persuade investors through evidence that a start-up can solve a valuable problem repeatedly and economically. A movement business inspired by lululemon might have an appealing community mission, but I would test whether participants return, pay, and recommend it without constant incentives. I would explain the target segment, alternatives, defensible advantages, and contribution after serving and acquiring customers. Funding should support specific milestones, such as validating repeat participation or expanding a proven local model. I would also identify risks, including dependence on individual instructors. The strongest pitch connects a human need with credible economics, rather than assuming that a passionate community automatically becomes a scalable and profitable business.</w:t>
       </w:r>
     </w:p>
     <w:p>
@@ -1997,7 +2155,7 @@
         <w:t>中文记忆提纲：</w:t>
       </w:r>
       <w:r>
-        <w:t>初创融资：痛点、替代不足、护城河→付费/复用证据→获客和服务成本→资金用途、里程碑、风险。注册≠产品市场匹配。</w:t>
+        <w:t>初创融资用运动社区假设：复返/付费/无持续补贴推荐→人群/替代/壁垒/贡献利润→里程碑；教练依赖风险。热情不自动可规模盈利。</w:t>
       </w:r>
     </w:p>
     <w:p>
@@ -2021,12 +2179,12 @@
         <w:rPr>
           <w:b/>
         </w:rPr>
-        <w:t>English answer · 105 words</w:t>
-      </w:r>
-    </w:p>
-    <w:p>
-      <w:r>
-        <w:t>I would estimate market demand by combining a broad market view with a realistic customer-level model. First, I would define the product, geography, time period, and target segment. Then I would estimate how many potential buyers exist, what proportion is likely to purchase, and their expected buying frequency and spending. For a learning app, survey interest should be checked against search behaviour, trial conversion, and actual willingness to pay. I would also distinguish total market demand from the share our business can realistically serve and win. Rather than present one precise-looking number, I would use scenarios and identify which assumptions most strongly affect the estimate.</w:t>
+        <w:t>English · 109 words</w:t>
+      </w:r>
+    </w:p>
+    <w:p>
+      <w:r>
+        <w:t>I would estimate demand by defining the customer job before counting potential buyers. For DJI Pocket, 'everyone who films' is too broad; I would identify people whose filming needs justify carrying a separate camera. I would combine population and purchase-frequency estimates with interviews, search behaviour, demonstrations, and willingness-to-pay tests. The key distinction is between interest in better footage and demand for this particular solution at its price. I would also estimate the share DJI could realistically reach and serve, then use scenarios rather than one precise-looking forecast. Sensitivity analysis would reveal whether the estimate depends mostly on segment size, conversion, replacement frequency, or assumptions about customers changing established habits.</w:t>
       </w:r>
     </w:p>
     <w:p>
@@ -2037,7 +2195,7 @@
         <w:t>中文记忆提纲：</w:t>
       </w:r>
       <w:r>
-        <w:t>需求估算：界定产品/地域/期间/人群→人数×购买概率×频次×金额；行为校验；区分总市场与可赢份额；情景＋敏感性。</w:t>
+        <w:t>需求先定义“愿为拍摄任务多带设备的人”；人数/频次＋行为/试用/价格测试；喜欢好视频≠买该方案；可触达份额、情景与敏感性。</w:t>
       </w:r>
     </w:p>
     <w:p>
@@ -2061,12 +2219,12 @@
         <w:rPr>
           <w:b/>
         </w:rPr>
-        <w:t>English answer · 107 words</w:t>
-      </w:r>
-    </w:p>
-    <w:p>
-      <w:r>
-        <w:t>For unmet consumer needs, I would use a mixed-method approach, beginning with qualitative discovery. Interviews and observation can reveal frustrations, workarounds, and needs that customers struggle to articulate. For example, a learner may request more lessons when the deeper difficulty is fitting practice into a busy day. I would translate those findings into a small number of hypotheses and test low-cost prototypes. A survey could then measure how common the problem is across different segments. Finally, I would check whether people actually adopt or pay for a solution. An unmet need becomes a marketing opportunity only when it is meaningful, addressable, and connected to viable customer behaviour.</w:t>
+        <w:t>English · 108 words</w:t>
+      </w:r>
+    </w:p>
+    <w:p>
+      <w:r>
+        <w:t>For unmet needs, I would combine contextual observation with interviews and behavioural tests. In a lululemon-related movement context, I would study people who want to exercise but do not join existing activities. Barriers might include confidence, scheduling, perceived exclusivity, or uncertainty about ability levels. These are hypotheses to investigate, not assumptions about every non-participant. I would then test a small change, such as clearer beginner information or a different activity time, and observe attendance and return behaviour. A survey could estimate how widespread the barrier is. The aim is to distinguish a genuinely underserved need from an attractive idea people support verbally but do not use in practice.</w:t>
       </w:r>
     </w:p>
     <w:p>
@@ -2077,7 +2235,7 @@
         <w:t>中文记忆提纲：</w:t>
       </w:r>
       <w:r>
-        <w:t>混合法：访谈观察发现→假设原型→问卷量化→真实使用/付费。学习者要“更多课”，本质或是没时间；需求需可解决可经营。</w:t>
+        <w:t>lululemon研究不参加者：信心/时间/排他感/水平不明是待验证假设→改新手说明/时段→出席复返→问卷规模。口头支持不等使用。</w:t>
       </w:r>
     </w:p>
     <w:p>
@@ -2101,12 +2259,12 @@
         <w:rPr>
           <w:b/>
         </w:rPr>
-        <w:t>English answer · 104 words</w:t>
-      </w:r>
-    </w:p>
-    <w:p>
-      <w:r>
-        <w:t>Changing interest rates affect both customer demand and business decisions. Higher rates usually make borrowing more expensive, which can reduce spending on financed purchases and raise the cost of business investment. Some savers may benefit from higher returns, so the effect differs across segments. Lower rates can support borrowing and spending, but the outcome depends on confidence, income, and wider economic conditions. For marketers, I would examine which customers are most exposed and adjust forecasts, offers, and payment options responsibly. A premium technology brand might emphasise durability and value over time, while avoiding the assumption that a discount alone can overcome genuine affordability constraints.</w:t>
+        <w:t>English · 111 words</w:t>
+      </w:r>
+    </w:p>
+    <w:p>
+      <w:r>
+        <w:t>Interest-rate changes affect both the ability to spend and the economics of investment. Higher rates can increase borrowing costs, making discretionary purchases such as a dedicated DJI camera harder to justify for some customers. They can also raise the cost of financing business expansion. However, the impact differs across segments; some savers may benefit, and income or confidence can matter more than rates alone. I would revise forecasts and understand which customers face genuine affordability constraints. Marketing could explain durable value or offer responsible payment choices, but should not encourage unsuitable borrowing. Lower rates are not an automatic demand solution if the product still fails to address a meaningful customer need.</w:t>
       </w:r>
     </w:p>
     <w:p>
@@ -2117,7 +2275,7 @@
         <w:t>中文记忆提纲：</w:t>
       </w:r>
       <w:r>
-        <w:t>利率：借贷成本→消费与企业投资；储蓄者可能受益，分人群。调整预测/价值表达/支付方案；降价解决不了所有负担。</w:t>
+        <w:t>利率→借贷/投资/可支配选择；DJI独立相机部分人难 justify，储蓄者可能受益。分群预测；价值/负责支付，不诱导不合适借贷。</w:t>
       </w:r>
     </w:p>
     <w:p>
@@ -2141,12 +2299,12 @@
         <w:rPr>
           <w:b/>
         </w:rPr>
-        <w:t>English answer · 108 words</w:t>
-      </w:r>
-    </w:p>
-    <w:p>
-      <w:r>
-        <w:t>In the digital era, I would analyse the marketing mix through the four Ps, while recognising that services may also require attention to people, process, and physical evidence. For a learning app, the product includes the learning experience and updates; price includes subscription options; place includes app stores and the website; promotion includes social content, search, and referrals. Digital tools connect these decisions more closely, because customers can respond immediately. However, an efficient promotional channel cannot compensate for confusing pricing or poor onboarding. I would focus on consistency across the mix, using customer feedback and experiments to improve the overall journey rather than optimising each element in isolation.</w:t>
+        <w:t>English · 107 words</w:t>
+      </w:r>
+    </w:p>
+    <w:p>
+      <w:r>
+        <w:t>In the digital era, the marketing mix becomes more connected, but the four Ps remain useful. For DJI, product value includes both filming capabilities and the effort required to use them. Price competes with the customer's existing phone, not just other camera prices. Place includes opportunities to research, try, and obtain support. Promotion should connect footage with a realistic understanding of the workflow. For lululemon, people and process also matter because community experiences influence the promise. I would evaluate the mix as a system: a persuasive video cannot compensate for confusing product selection, and an inviting event cannot compensate for a disappointing product or inaccessible participation experience.</w:t>
       </w:r>
     </w:p>
     <w:p>
@@ -2157,7 +2315,7 @@
         <w:t>中文记忆提纲：</w:t>
       </w:r>
       <w:r>
-        <w:t>【按marketing mix理解“营销矩阵”】4P，服务可补3P；学习App串联产品、订阅、分发、推广。关键一致性，别单点优化。</w:t>
+        <w:t>数字4P系统：DJI产品含使用成本、价格对比“现有手机”、渠道研究试用支持、推广含流程；lululemon补人和过程。不能单点优化。</w:t>
       </w:r>
     </w:p>
     <w:p>
@@ -2181,12 +2339,12 @@
         <w:rPr>
           <w:b/>
         </w:rPr>
-        <w:t>English answer · 105 words</w:t>
-      </w:r>
-    </w:p>
-    <w:p>
-      <w:r>
-        <w:t>I would say that the consumer is central, but not all-powerful. The phrase reminds companies that they cannot create sustainable demand by ignoring customer needs. However, good business decisions also consider fairness, employee wellbeing, and the consequences for other customers. In addition, consumers do not always know which solution will best address their problem. For a learning app, users may ask for longer courses when what they need is a more achievable routine. I would listen carefully, investigate the underlying need, and explain trade-offs honestly. Customer orientation means taking people seriously and creating lasting value, rather than promising everything or accepting every demand without judgement.</w:t>
+        <w:t>English · 107 words</w:t>
+      </w:r>
+    </w:p>
+    <w:p>
+      <w:r>
+        <w:t>I would interpret 'consumer is king' as a reminder that value is judged through the customer's experience, not the company's enthusiasm. However, it should not mean accepting every request without considering consequences. For lululemon, a participant's desire for a more supportive activity is important, but accommodating one person should not undermine others' safety or the instructor's wellbeing. I would listen, identify the underlying need, and explain reasonable boundaries. Sometimes the appropriate response is a different format rather than an exception. Customer-centred marketing combines respect with judgement: it seeks lasting value for the relationship, rather than treating immediate satisfaction or another transaction as the only measure of success.</w:t>
       </w:r>
     </w:p>
     <w:p>
@@ -2197,7 +2355,7 @@
         <w:t>中文记忆提纲：</w:t>
       </w:r>
       <w:r>
-        <w:t>consumer is king同题21：中心非绝对权力；公平/员工/他人；学习App“更长课”背后可能是可坚持习惯。倾听＋判断＋诚实权衡。</w:t>
+        <w:t>同顾客为王换lululemon场景：体验决定价值；个体需求需兼顾安全/教练/其他参与者。倾听底层需要、说明边界，长期关系非即时满足。</w:t>
       </w:r>
     </w:p>
     <w:p>
@@ -2221,12 +2379,12 @@
         <w:rPr>
           <w:b/>
         </w:rPr>
-        <w:t>English answer · 108 words</w:t>
-      </w:r>
-    </w:p>
-    <w:p>
-      <w:r>
-        <w:t>There is no universally best low-budget marketing tactic; effectiveness depends on the audience and how people make decisions. For a learning app, I would prioritise useful content that answers a narrow need, supported by a strong onboarding experience and referrals from satisfied users. For a local service, search visibility and credible reviews might matter more. I would begin with channels that match existing customer intent, then test a small number of messages. Organic activity still costs time, so I would compare the full cost of each approach. The goal would be profitable learning and repeatable acquisition, rather than maximising exposure or assuming that unpaid channels are automatically free.</w:t>
+        <w:t>English · 110 words</w:t>
+      </w:r>
+    </w:p>
+    <w:p>
+      <w:r>
+        <w:t>On a limited budget, I would choose the approach that produces useful learning and credible customer evidence with the least wasted effort. For a lululemon-inspired local movement initiative, that could mean working with one trusted instructor and designing a genuinely welcoming first session. Clear information and participant feedback may be more valuable than broad paid reach. I would then test a simple invitation and follow-up journey, measuring first-time attendance and return participation. This is a proposed approach, not a description of an existing programme. I would include staff time and coordination in the cost, because community marketing is not free. The priority is a repeatable experience, not one impressive launch.</w:t>
       </w:r>
     </w:p>
     <w:p>
@@ -2237,7 +2395,7 @@
         <w:t>中文记忆提纲：</w:t>
       </w:r>
       <w:r>
-        <w:t>小预算无万能战术：App内容/推荐，本地服务搜索/评价；匹配意图→小实验→算时间成本。自然流量不免费。</w:t>
+        <w:t>预算有限用运动社区：一位可信导师＋友好首场→清晰邀请/反馈/跟进→首次与复返；计人工协调成本。是建议方案，追重复性不追首秀。</w:t>
       </w:r>
     </w:p>
     <w:p>
@@ -2261,12 +2419,12 @@
         <w:rPr>
           <w:b/>
         </w:rPr>
-        <w:t>English answer · 108 words</w:t>
-      </w:r>
-    </w:p>
-    <w:p>
-      <w:r>
-        <w:t>Duolingo shows how online marketing can reposition a brand's personality without changing its basic product category. Through the owl mascot, humorous videos, and participation in online conversations, it presents language learning as familiar and culturally relevant. The mechanism is repeated association: customers encounter the same distinctive character in entertaining contexts, making the brand easier to recognise and discuss. However, I would evaluate whether that image attracts suitable learners, not merely viewers. Brand perception research could test changes in familiarity and approachability, while product data could show whether new users stay. A successful image shift should support the experience the brand delivers, rather than create expectations it cannot meet.</w:t>
+        <w:t>English · 110 words</w:t>
+      </w:r>
+    </w:p>
+    <w:p>
+      <w:r>
+        <w:t>Lululemon's Be Spring film from Lunar New Year 2024 illustrates how online communication can broaden a brand's associations. Michelle Yeoh and Wing Chun dancers connect movement to renewal and cultural expression, suggesting a meaning beyond one exercise category. The mechanism is not simply celebrity visibility; it is a connection between an established brand theme and a culturally relevant occasion. I would evaluate whether viewers understand that connection and whether it changes consideration among relevant audiences. I would not infer lasting image change from sharing alone. The campaign is strategically interesting when cultural storytelling expands the invitation to move while remaining consistent with product credibility and the experience customers encounter afterwards.</w:t>
       </w:r>
     </w:p>
     <w:p>
@@ -2277,7 +2435,7 @@
         <w:t>中文记忆提纲：</w:t>
       </w:r>
       <w:r>
-        <w:t>同Duolingo案例换角度：反复关联塑造亲切人格；测熟悉/亲近感＋新用户留存，品牌形象与交付一致。</w:t>
+        <w:t>Be Spring线上形象：不只是明星曝光，运动主题连接节日文化；测理解/相关人群考虑，而非分享推断长期改变。文化扩展须与体验一致。</w:t>
       </w:r>
     </w:p>
     <w:p>
@@ -2301,12 +2459,12 @@
         <w:rPr>
           <w:b/>
         </w:rPr>
-        <w:t>English answer · 106 words</w:t>
-      </w:r>
-    </w:p>
-    <w:p>
-      <w:r>
-        <w:t>I think disputes between marketing and R&amp;D often reflect a missing shared decision process. Marketing may bring urgent requests from customers, while R&amp;D sees technical uncertainty and competing development priorities. If neither side explains the reasoning, a discussion becomes a struggle over whose deadline matters more. I would agree on the customer problem first, then compare possible solutions using desirability, feasibility, and commercial viability. A small prototype can replace speculation with evidence. I would also involve both teams early and define what can be delivered now versus later. The aim is not to eliminate disagreement, but to make disagreement productive through shared criteria and transparent trade-offs.</w:t>
+        <w:t>English · 107 words</w:t>
+      </w:r>
+    </w:p>
+    <w:p>
+      <w:r>
+        <w:t>Conflict between marketing and R&amp;D often persists because requests are expressed as solutions before the customer problem is agreed. In a DJI-style project, marketing might demand a new feature, while engineering questions its weight, battery implications, or reliability. I would reframe the conversation around a task: what footage does the customer fail to capture, and why? The teams could compare alternative solutions, including clearer guidance rather than additional hardware. A prototype would test desirability and feasibility, while commercial analysis would check cost and value. This makes disagreement useful. The goal is not more features or faster promotion, but the simplest credible solution to a meaningful customer barrier.</w:t>
       </w:r>
     </w:p>
     <w:p>
@@ -2317,7 +2475,7 @@
         <w:t>中文记忆提纲：</w:t>
       </w:r>
       <w:r>
-        <w:t>部门之争＝缺共同决策机制；需求性/可行性/商业可行性三标准→原型→当前/后续范围。让分歧产出证据，不求完全无分歧。</w:t>
+        <w:t>部门冲突第二角度：别先指定功能，先找没拍成的任务；功能/指导等替代方案→原型＋成本价值。最简单可信解决方案未必更多硬件。</w:t>
       </w:r>
     </w:p>
     <w:p>
@@ -2341,12 +2499,12 @@
         <w:rPr>
           <w:b/>
         </w:rPr>
-        <w:t>English answer · 105 words</w:t>
-      </w:r>
-    </w:p>
-    <w:p>
-      <w:r>
-        <w:t>Similar brands can differentiate by choosing different customer priorities, rather than claiming to be better at everything. Apple and Huawei both offer advanced smartphones, but Apple often emphasises an integrated experience, while Huawei frequently foregrounds engineering, photography, and connectivity. The distinction becomes meaningful only when the product and service support it. I would research which benefits different segments value, including convenience, flexibility, availability, and ecosystem compatibility. Then I would build a clear position around a benefit the brand can credibly own. A distinctive logo or slogan helps recognition, but sustainable differentiation requires a reason to choose that remains relevant after customers have used the product.</w:t>
+        <w:t>English · 110 words</w:t>
+      </w:r>
+    </w:p>
+    <w:p>
+      <w:r>
+        <w:t>Similar brands can differentiate by solving a different customer job or reducing a different source of friction. DJI's Pocket and Action lines illustrate this logic within one brand: everyday storytelling and activity recording can require different equipment priorities. For lululemon, meaningful differentiation may combine apparel performance with a supportive movement experience, rather than visual identity alone. I would research which trade-offs customers actually value and build the proposition around a benefit the business can deliver consistently. The strongest differentiation is not being unusual for its own sake. It is making a customer think, 'this fits my situation better', and giving them evidence that remains convincing after real use or participation.</w:t>
       </w:r>
     </w:p>
     <w:p>
@@ -2357,7 +2515,7 @@
         <w:t>中文记忆提纲：</w:t>
       </w:r>
       <w:r>
-        <w:t>相似品牌：选择不同价值优先级，非全方位“最好”。Apple/Huawei共用；研究分群→可信利益→体验验证，视觉不同不等于可持续差异。</w:t>
+        <w:t>差异化＝解决不同任务/阻碍；Pocket/Action示例，lululemon性能＋支持性体验。不是为了不同而不同，顾客认为更适合且使用后仍成立。</w:t>
       </w:r>
     </w:p>
     <w:p>
@@ -2381,12 +2539,12 @@
         <w:rPr>
           <w:b/>
         </w:rPr>
-        <w:t>English answer · 108 words</w:t>
-      </w:r>
-    </w:p>
-    <w:p>
-      <w:r>
-        <w:t>To keep up with new marketing strategies, I would separate discovery from adoption. Discovery involves reading credible industry analysis, platform updates, and research, as well as watching how customers and competitors behave. Adoption requires a stronger test: does the approach address our objective, fit our audience, and justify its costs and risks? Duolingo's social strategy is useful to study, but copying its humour would not necessarily work for a different brand. I would run small experiments, compare results with a baseline, and document the conditions behind success. This helps build transferable knowledge, rather than an endless collection of tactics that lose relevance when the platform or audience changes.</w:t>
+        <w:t>English · 111 words</w:t>
+      </w:r>
+    </w:p>
+    <w:p>
+      <w:r>
+        <w:t>To keep up with new strategies, I would distinguish useful principles from visible tactics. A lululemon community event is worth studying not because events are fashionable, but because participation may make the brand's promise tangible. A DJI demonstration is useful when it reduces uncertainty, not simply because video performs well on a platform. I would follow research and customer behaviour, extract a hypothesis, and test whether the mechanism transfers to our context. Results should be compared with a baseline and recorded alongside limitations. This prevents copying attractive examples without understanding why they work. Staying current means improving strategic judgement, rather than repeatedly changing channels and leaving the underlying customer problem unresolved.</w:t>
       </w:r>
     </w:p>
     <w:p>
@@ -2397,7 +2555,7 @@
         <w:t>中文记忆提纲：</w:t>
       </w:r>
       <w:r>
-        <w:t>更新策略＝发现与采用分开。读资料看行为→目标/人群/成本风险筛选→小实验与基线→记录适用条件。借Duolingo机制不抄语气。</w:t>
+        <w:t>更新策略提炼机制：lululemon参与兑现承诺、DJI演示减少疑虑→假设能否迁移→基线测试记录限制。抄形式不等懂效果。</w:t>
       </w:r>
     </w:p>
     <w:p>
@@ -2421,12 +2579,12 @@
         <w:rPr>
           <w:b/>
         </w:rPr>
-        <w:t>English answer · 105 words</w:t>
-      </w:r>
-    </w:p>
-    <w:p>
-      <w:r>
-        <w:t>I would evaluate a logo change in three stages: strategic purpose, customer response, and implementation. First, does the new identity express a meaningful positioning change or solve a practical design problem? Second, do customers still recognise the brand, and does the design improve the intended associations? I would test it in realistic contexts, such as a small app icon or packaging, rather than judge a large image alone. Third, I would assess rollout costs and consistency across touchpoints. Positive social comments are not enough, because reactions may reflect novelty. A successful change improves usability or brand meaning without unnecessarily discarding recognition built over many years.</w:t>
+        <w:t>English · 112 words</w:t>
+      </w:r>
+    </w:p>
+    <w:p>
+      <w:r>
+        <w:t>I would evaluate a logo change by asking whether it solves a real recognition or positioning problem. For DJI, a visual update might improve readability across product screens and digital content, but it would not address confusion between Pocket and Action use cases by itself. I would test the design in realistic contexts, measure recognition and intended associations, and estimate rollout costs. Existing familiarity should be treated as an asset, not an obstacle to novelty. Customer feedback matters, but immediate social reactions can overstate both enthusiasm and resistance. A successful change strengthens a useful cue within the brand experience, rather than creating activity that looks like strategic progress without improving customer understanding.</w:t>
       </w:r>
     </w:p>
     <w:p>
@@ -2437,7 +2595,7 @@
         <w:t>中文记忆提纲：</w:t>
       </w:r>
       <w:r>
-        <w:t>评价换标三步：目的→顾客反应→实施；真实小图标/包装测试；社媒好评不够，新鲜感非长期价值，保留识别资产。</w:t>
+        <w:t>DJI换标：数字可读性可能改善，但不能独自解决选型困惑；真实场景测试/识别联想/成本。熟悉感是资产，舆论瞬时反应未必长期效果。</w:t>
       </w:r>
     </w:p>
     <w:p>
@@ -2445,7 +2603,7 @@
         <w:pStyle w:val="Heading1"/>
       </w:pPr>
       <w:r>
-        <w:t>54. Strategy of Apple and Huawei</w:t>
+        <w:t>54. 比较大疆与lululemon的营销战略【按你的新方向调整原题指定品牌】</w:t>
       </w:r>
     </w:p>
     <w:p>
@@ -2453,7 +2611,7 @@
         <w:pStyle w:val="Subtitle"/>
       </w:pPr>
       <w:r>
-        <w:t>Compare the strategies of Apple and Huawei.</w:t>
+        <w:t>Compare the marketing strategies of DJI and lululemon.</w:t>
       </w:r>
     </w:p>
     <w:p>
@@ -2461,12 +2619,12 @@
         <w:rPr>
           <w:b/>
         </w:rPr>
-        <w:t>English answer · 108 words</w:t>
-      </w:r>
-    </w:p>
-    <w:p>
-      <w:r>
-        <w:t>Apple and Huawei illustrate different ways of creating value within the smartphone category. Apple combines premium positioning with an integrated hardware, software, and services experience, making continuity across devices a central benefit. Huawei often emphasises technological capability, photography, and connectivity, supported by its broader device ecosystem. Their strategies also reflect different market conditions: regional availability, regulation, and app access can shape what each brand can offer. I would therefore avoid presenting them as identical global competitors in every segment. The strategic lesson is that differentiation involves aligning capabilities, customer priorities, and market constraints, rather than simply comparing specifications or assuming one brand attracts only one type of buyer.</w:t>
+        <w:t>English · 110 words</w:t>
+      </w:r>
+    </w:p>
+    <w:p>
+      <w:r>
+        <w:t>DJI and lululemon build premium propositions through different forms of customer capability. DJI helps people capture experiences more effectively; lululemon connects technical apparel with participation in movement. DJI can demonstrate value through visible filming outcomes, while lululemon's promise also depends on how products feel and how community experiences welcome people. The comparison is strategic, not a claim that they compete in the same category. Both face an important challenge: making aspiration achievable rather than intimidating. I would evaluate whether customers can progress from admiring the brand to using it confidently. Premium positioning is stronger when it creates credible value, not when price or exclusivity becomes the main evidence of quality.</w:t>
       </w:r>
     </w:p>
     <w:p>
@@ -2477,7 +2635,7 @@
         <w:t>中文记忆提纲：</w:t>
       </w:r>
       <w:r>
-        <w:t>Apple/Huawei战略：定位＋能力＋市场约束。前者生态连续性，后者技术/影像/连接；区域、监管、应用影响竞争，不用客户刻板标签。</w:t>
+        <w:t>【按用户要求改两品牌战略】DJI创作能力，lululemon运动参与；非同品类竞争。共题：向往能否变成可做到？溢价需真实价值，不靠排他性证明。</w:t>
       </w:r>
     </w:p>
     <w:p>
@@ -2501,12 +2659,12 @@
         <w:rPr>
           <w:b/>
         </w:rPr>
-        <w:t>English answer · 105 words</w:t>
-      </w:r>
-    </w:p>
-    <w:p>
-      <w:r>
-        <w:t>Google Analytics can help digital marketers understand how users arrive, what they do, and where journeys break down. In GA4, event-based measurement can track actions such as sign-ups, purchases, or lesson starts, allowing marketers to compare audiences and channels. For a learning app, I would examine whether a campaign attracts users who progress beyond registration. However, analytics does not automatically explain motivation or prove that advertising caused a conversion. Consent choices, tracking gaps, and attribution assumptions affect the data. I would combine it with interviews, product data, and controlled experiments. Its value is supporting better questions and decisions, not producing a dashboard that looks precise.</w:t>
+        <w:t>English · 112 words</w:t>
+      </w:r>
+    </w:p>
+    <w:p>
+      <w:r>
+        <w:t>Google Analytics helps marketers see where a digital journey succeeds or breaks down. In GA4, event-based measurement could track a DJI visitor moving from a tutorial to a product comparison or demonstration enquiry. For a lululemon activity page, it could examine registration steps, while actual attendance needs appropriate additional records and consent. I would distinguish website activity from meaningful outcomes: clicking a camera comparison does not prove understanding, and registering does not prove participation. Attribution also depends on tracking coverage and modelling assumptions. I would combine analytics with customer research and controlled tests, using the dashboard to locate questions rather than treating its numbers as a complete explanation of motivation or impact.</w:t>
       </w:r>
     </w:p>
     <w:p>
@@ -2517,7 +2675,7 @@
         <w:t>中文记忆提纲：</w:t>
       </w:r>
       <w:r>
-        <w:t>GA4：事件追踪→来源/路径/流失/转化质量；注册后是否开始学习。隐私许可、漏数、归因影响结果；配访谈和实验，不能证明因果。</w:t>
+        <w:t>GA4追事件：DJI教程→对比→试用咨询；lululemon注册→出席需补数据和许可。点击≠理解，注册≠参加；归因有限，结合研究实验。</w:t>
       </w:r>
     </w:p>
     <w:p>
@@ -2541,12 +2699,12 @@
         <w:rPr>
           <w:b/>
         </w:rPr>
-        <w:t>English answer · 107 words</w:t>
-      </w:r>
-    </w:p>
-    <w:p>
-      <w:r>
-        <w:t>Marketing success means creating value for customers in a way that supports the organisation's objectives over time. It is broader than a successful advertisement or a temporary sales increase. I would look at whether the brand attracts the right customers, delivers its promise, retains their trust, and earns sustainable returns. Nike, for example, benefits when its positioning motivates purchase and the product experience gives customers a reason to return. The relevant measures depend on the business, but may include incremental demand, retention, margins, and brand preference. I would also consider costs and negative effects, because visible growth can conceal weak economics or damage to the long-term relationship.</w:t>
+        <w:t>English · 108 words</w:t>
+      </w:r>
+    </w:p>
+    <w:p>
+      <w:r>
+        <w:t>Marketing success means helping the right customers achieve a valued outcome while creating sustainable value for the business. For DJI, selling a camera is incomplete success if it remains unused because the workflow feels overwhelming. For lululemon, a full event is incomplete success if newcomers feel unwelcome and never return. I would assess acquisition quality, adoption, satisfaction, repeat behaviour, and contribution after costs. Incrementality matters because existing enthusiasts may have bought or attended anyway. This definition is deliberately broader than campaign performance. Successful marketing aligns expectation with experience, so the next purchase or recommendation grows from genuine value rather than continued persuasion compensating for a weak underlying relationship.</w:t>
       </w:r>
     </w:p>
     <w:p>
@@ -2557,7 +2715,7 @@
         <w:t>中文记忆提纲：</w:t>
       </w:r>
       <w:r>
-        <w:t>营销成功大于单活动：价值兑现＋可持续商业结果；Nike定位促买、体验促留。增量/留存/利润/偏好，增长可能掩盖经济性差。</w:t>
+        <w:t>营销成功：DJI卖出但闲置、lululemon满场却新人不回都不完整；获客质量/采纳/满意/复返/成本后贡献＋增量。期望体验一致才可持续。</w:t>
       </w:r>
     </w:p>
     <w:p>
@@ -2581,12 +2739,12 @@
         <w:rPr>
           <w:b/>
         </w:rPr>
-        <w:t>English answer · 109 words</w:t>
-      </w:r>
-    </w:p>
-    <w:p>
-      <w:r>
-        <w:t>For untapped needs, my first choice would be contextual observation combined with in-depth interviews. Asking people what they want can produce familiar feature requests, while observing their actual routines reveals obstacles they may take for granted. For a learning app, I would watch when users try to study, what interrupts them, and how they compensate when the app does not help. I would include non-users and people who abandoned similar products, not only enthusiastic customers. After identifying patterns, I would validate them through prototypes and broader research. There is no single method that proves demand; qualitative discovery should lead to behavioural evidence and a realistic assessment of market size.</w:t>
+        <w:t>English · 110 words</w:t>
+      </w:r>
+    </w:p>
+    <w:p>
+      <w:r>
+        <w:t>For discovering untapped needs, I would start with contextual observation and interviews that focus on abandoned attempts. DJI offers a useful setting: I would ask people to show occasions when they wanted to record something but did not. This can reveal social awkwardness, carrying effort, or editing concerns that a feature survey overlooks. I would deliberately include non-buyers, phone-only users, and people who stopped using a dedicated camera. Then I would test a low-cost solution and observe whether the abandoned behaviour becomes achievable. No method independently establishes a market. Qualitative discovery should lead to behavioural validation and an estimate of how many customers share the problem at a viable price.</w:t>
       </w:r>
     </w:p>
     <w:p>
@@ -2597,7 +2755,7 @@
         <w:t>中文记忆提纲：</w:t>
       </w:r>
       <w:r>
-        <w:t>最佳起点：情境观察＋深访；纳入非用户、流失者，避免只访忠粉。发现隐性障碍→原型行为验证→规模判断，无单法证明需求。</w:t>
+        <w:t>未开发需求最合适起点：观察放弃的拍摄→社交尴尬/携带/剪辑；非买家和弃用者→低成本干预→行为与市场规模。不能只问想要功能。</w:t>
       </w:r>
     </w:p>
     <w:p>
@@ -2621,12 +2779,12 @@
         <w:rPr>
           <w:b/>
         </w:rPr>
-        <w:t>English answer · 107 words</w:t>
-      </w:r>
-    </w:p>
-    <w:p>
-      <w:r>
-        <w:t>One marketing approach I like is Nike's use of athlete storytelling. Instead of presenting a product only through features, it places performance within a story of effort, setbacks, and progress. This makes the brand relevant to customers who may never compete professionally but still recognise the emotional experience of pursuing a goal. The approach works best when the athlete's story supports Nike's wider positioning and the product has a credible role. However, celebrity attention alone is not enough, and partnerships carry reputational risks. What I would learn is to connect an authentic human tension with the brand's value, rather than assuming a famous face automatically creates persuasion.</w:t>
+        <w:t>English · 105 words</w:t>
+      </w:r>
+    </w:p>
+    <w:p>
+      <w:r>
+        <w:t>One approach I like is lululemon's use of local ambassadors to connect the brand with movement communities. The potential strength is contextual trust: an instructor can understand a participant's routine and concerns more closely than a distant celebrity campaign. However, I would not assume a partnership automatically creates authentic belonging. The experience must welcome newcomers and provide value even when they do not purchase immediately. I would measure participation quality, repeat attendance, and the relationship between the experience and brand consideration. The lesson is to build proximity around a useful practice, rather than borrow a popular person's audience and call the resulting attention a community.</w:t>
       </w:r>
     </w:p>
     <w:p>
@@ -2637,7 +2795,7 @@
         <w:t>中文记忆提纲：</w:t>
       </w:r>
       <w:r>
-        <w:t>Nike运动员故事：努力/挫折/进步让普通人共鸣；故事与定位、产品相关。名气不等于说服力，代言有声誉风险。</w:t>
+        <w:t>lululemon大使：近距离情境信任＞借明星受众；不自动真实归属。新人欢迎/不立刻购买仍有价值→参与质量/复返/品牌考虑。</w:t>
       </w:r>
     </w:p>
     <w:p>
@@ -2661,12 +2819,12 @@
         <w:rPr>
           <w:b/>
         </w:rPr>
-        <w:t>English answer · 106 words</w:t>
-      </w:r>
-    </w:p>
-    <w:p>
-      <w:r>
-        <w:t>I would measure a campaign through a hierarchy of outcomes. First, did it reach the intended audience? Second, did it change relevant attitudes or behaviour? Third, did that change create value at an acceptable cost? For a subscription app, I would track qualified sign-ups, paid conversion, retention, and contribution after campaign spending. I would compare results with a baseline and, where practical, a control group, because people may have purchased anyway. Longer-term brand effects also deserve attention, even when they are harder to attribute. Before launch, I would agree on the main objective and evaluation period so the team cannot redefine success after seeing the results.</w:t>
+        <w:t>English · 108 words</w:t>
+      </w:r>
+    </w:p>
+    <w:p>
+      <w:r>
+        <w:t>I would measure campaign success through a progression from exposure to useful behaviour and then to business value. For DJI, that might include engaged tutorial viewing, informed product consideration, purchases, and evidence of successful use. For lululemon, it could include first-time participation, return attendance, and subsequent preference. I would select the primary outcome before launch and compare results with a reasonable baseline or holdout. Costs should include production, incentives, and staff time, not just media spending. I would also examine returns, complaints, or exclusion. The important question is whether the campaign improved the relationship and economics, rather than moving an easy-to-report metric while leaving the real objective unchanged.</w:t>
       </w:r>
     </w:p>
     <w:p>
@@ -2677,7 +2835,7 @@
         <w:t>中文记忆提纲：</w:t>
       </w:r>
       <w:r>
-        <w:t>衡量三层：触达→态度/行为→经济价值。订阅转化/留存/贡献利润；基线＋对照；预先定目标和周期，防事后改口。</w:t>
+        <w:t>活动衡量链：曝光→有用行为→商业；DJI理解/购买/用好，lululemon首次/复返/偏好。事先主指标、对照、全成本与负面结果。</w:t>
       </w:r>
     </w:p>
     <w:p>
@@ -2701,12 +2859,12 @@
         <w:rPr>
           <w:b/>
         </w:rPr>
-        <w:t>English answer · 108 words</w:t>
-      </w:r>
-    </w:p>
-    <w:p>
-      <w:r>
-        <w:t>Apple and Huawei differentiate by translating their capabilities into different reasons to choose. Apple often makes ecosystem continuity, intuitive use, and a consistent premium experience central to its proposition. Huawei frequently stresses technological performance, photography, and connectivity, alongside an ecosystem relevant to its available markets. These positions attract overlapping audiences, so I would not divide customers into simplistic categories. To compare the strategies, I would examine a particular market, price tier, and customer use case. Then I would assess how product features, distribution, communication, and service reinforce each proposition. Effective differentiation is the alignment of those elements around a customer priority competitors cannot easily match in that context.</w:t>
+        <w:t>English · 111 words</w:t>
+      </w:r>
+    </w:p>
+    <w:p>
+      <w:r>
+        <w:t>DJI and lululemon offer a useful comparison of differentiation mechanisms, although they operate in different categories. DJI can make technical value visible through the footage customers produce, using Pocket and Action to address different filming situations. Lululemon combines apparel functionality with an identity shaped through movement and community participation. Both benefit when marketing helps customers experience the promise, rather than merely admire it. I would compare their target jobs, evidence of value, and routes to repeat engagement. For a same-category comparison, DJI's two camera lines provide the closer product-level example. The broader lesson is that differentiation becomes credible through a system of choices, not a distinctive campaign or premium price alone.</w:t>
       </w:r>
     </w:p>
     <w:p>
@@ -2717,7 +2875,7 @@
         <w:t>中文记忆提纲：</w:t>
       </w:r>
       <w:r>
-        <w:t>两品牌差异化共用：同市场/价位/场景对比；Apple生态易用，Huawei技术影像。4P和服务支撑客户优先项，顾客群可重叠。</w:t>
+        <w:t>【跨品类比较注明】DJI效果证据/场景产品线；lululemon功能/运动认同/参与。同品类可补Pocket/Action但属同公司；差异化是系统，不是贵或广告特别。</w:t>
       </w:r>
     </w:p>
     <w:p>
@@ -2741,12 +2899,12 @@
         <w:rPr>
           <w:b/>
         </w:rPr>
-        <w:t>English answer · 110 words</w:t>
-      </w:r>
-    </w:p>
-    <w:p>
-      <w:r>
-        <w:t>If I had to choose one element behind brand success, I would choose trust built through consistent delivery. Distinctive communication can make a brand memorable, but customers need repeated evidence that its promise is reliable. For Apple, an important part of that evidence is the connected experience across devices and services. Trust also reduces uncertainty when customers consider a new product from the same brand. However, consistency should not become rigidity: expectations change, and a brand must improve without losing its core meaning. I would therefore build trust through dependable quality, honest communication, and responsive service, while keeping the promise sufficiently distinctive to give customers a reason to prefer it.</w:t>
+        <w:t>English · 112 words</w:t>
+      </w:r>
+    </w:p>
+    <w:p>
+      <w:r>
+        <w:t>If I had to choose one element of brand success, I would choose trust in the promise, built through repeated experience. For DJI, customers should believe they can capture the relevant moment without being misled about the effort involved. For lululemon, people should find credible product performance and feel that the invitation to move includes them. Trust reduces uncertainty when customers consider returning or recommending the brand. However, it should not become an excuse for keeping everything unchanged. Needs evolve, so delivery must improve while the core meaning remains clear. I would prioritise honest expectations, dependable experiences, and responsive support over short-lived attention that creates a larger gap between aspiration and reality.</w:t>
       </w:r>
     </w:p>
     <w:p>
@@ -2757,7 +2915,7 @@
         <w:t>中文记忆提纲：</w:t>
       </w:r>
       <w:r>
-        <w:t>核心选“信任”：反复兑现承诺降低决策不确定性；Apple生态。稳定不僵化，质量＋诚实沟通＋响应服务，并保持差异化。</w:t>
+        <w:t>核心元素信任：DJI诚实说明拍摄努力、lululemon性能与包容兑现。信任利复选推荐，但不僵化；缩小向往和现实差距。</w:t>
       </w:r>
     </w:p>
     <w:p>
@@ -2781,12 +2939,12 @@
         <w:rPr>
           <w:b/>
         </w:rPr>
-        <w:t>English answer · 108 words</w:t>
-      </w:r>
-    </w:p>
-    <w:p>
-      <w:r>
-        <w:t>I think successful people, including marketers, combine adaptability with disciplined judgement. Adaptability helps them respond when conditions change, while discipline prevents them from abandoning a good direction after every setback. They are curious enough to seek evidence, humble enough to revise assumptions, and clear enough to bring others with them. In marketing, this might mean recognising that a campaign attracts attention but not valuable customers, then changing the approach rather than defending the original idea. I would also include integrity, because short-term results achieved through misleading claims damage future opportunities. Success is not just persistence; it is learning which goals deserve persistence and which methods need to change.</w:t>
+        <w:t>English · 111 words</w:t>
+      </w:r>
+    </w:p>
+    <w:p>
+      <w:r>
+        <w:t>Successful marketers combine curiosity with disciplined willingness to revise their ideas. They investigate what customers actually do, communicate clearly across teams, and distinguish evidence from an attractive explanation. For DJI, that could mean admitting that polished footage generates attention but does not resolve beginners' uncertainty. For lululemon, it could mean discovering that a popular event serves existing fans better than new participants. I would also include integrity and resilience: disappointing results should lead to learning, not manipulated metrics or exaggerated claims. The quality I value most is productive humility, because it allows creativity to improve through feedback instead of becoming an idea the team feels compelled to defend at any cost.</w:t>
       </w:r>
     </w:p>
     <w:p>
@@ -2797,7 +2955,7 @@
         <w:t>中文记忆提纲：</w:t>
       </w:r>
       <w:r>
-        <w:t>成功者/营销者：适应＋纪律、好奇＋谦逊、沟通＋诚信。流量无质量就改方法；坚持目标不等于死守做法。</w:t>
+        <w:t>成功品质：好奇＋修正、沟通、证据、诚信韧性；DJI漂亮片未解新手疑虑、lululemon热场仅服务旧粉。谦逊使创意可迭代。</w:t>
       </w:r>
     </w:p>
     <w:p>
@@ -2821,12 +2979,12 @@
         <w:rPr>
           <w:b/>
         </w:rPr>
-        <w:t>English answer · 108 words</w:t>
-      </w:r>
-    </w:p>
-    <w:p>
-      <w:r>
-        <w:t>Duolingo is a brand whose marketing strategy connects an accessible learning proposition with a highly recognisable personality. Its free-entry model lowers the barrier to trying the product, while the owl mascot and playful communication make the brand easier to remember. Social content extends that personality into conversations people already follow, creating opportunities for discovery beyond conventional educational advertising. However, the strategic objective should remain useful learning and sustainable customer relationships, not simply entertainment. I would assess how awareness translates into engaged learners and paid value where relevant. The interesting lesson is that positioning, product access, and communication can reinforce each other when they share a consistent underlying idea.</w:t>
+        <w:t>English · 107 words</w:t>
+      </w:r>
+    </w:p>
+    <w:p>
+      <w:r>
+        <w:t>DJI is a brand whose consumer-camera strategy I would interpret through creative capability rather than hardware alone. Pocket and Action give the brand ways to address different filming jobs, while demonstrations and practical guidance can help customers imagine successful use. The strategic opportunity is to shorten the path from wanting to capture a moment to producing something usable. However, the customer also compares the device with carrying no extra equipment and using a phone. I would therefore avoid universal claims of superiority. Strong marketing explains when a dedicated camera earns its place, supports the workflow after purchase, and makes the value proposition clear for a particular situation.</w:t>
       </w:r>
     </w:p>
     <w:p>
@@ -2837,7 +2995,7 @@
         <w:t>中文记忆提纲：</w:t>
       </w:r>
       <w:r>
-        <w:t>Duolingo整体策略：低门槛试用＋鲜明角色＋社交参与；定位、入口、传播一致。终点仍是学习、留存与商业价值。</w:t>
+        <w:t>DJI策略：创作能力非硬件清单；Pocket/Action不同任务＋演示指导→拍得成；竞争也包括不带设备和手机，说明何时值得多带。</w:t>
       </w:r>
     </w:p>
     <w:p>
@@ -2858,7 +3016,7 @@
     </w:p>
     <w:p>
       <w:r>
-        <w:t>案例时间：2025年2月。并非最新活动，面试前请检查时间相关性。</w:t>
+        <w:t>时间限制：正文诚实使用2024历史活动，并不完全满足“近期”要求；待官网可访问后核实近期案例。</w:t>
       </w:r>
     </w:p>
     <w:p>
@@ -2866,12 +3024,12 @@
         <w:rPr>
           <w:b/>
         </w:rPr>
-        <w:t>English answer · 103 words</w:t>
-      </w:r>
-    </w:p>
-    <w:p>
-      <w:r>
-        <w:t>One campaign I would discuss is Duolingo's 'Duo is dead' storyline from February 2025. The brand temporarily announced the mascot's death and developed a playful narrative around its return, inviting audiences to participate rather than simply watch an advertisement. Its strength was the fit between the unusual story and an already established brand personality. This gave people a recognisable character and a reason to discuss the campaign. However, I would distinguish public attention from proven business results, and I would not invent conversion figures. The strategic lesson is that participation works best when it connects an engaging story with the product's existing identity.</w:t>
+        <w:t>English · 105 words</w:t>
+      </w:r>
+    </w:p>
+    <w:p>
+      <w:r>
+        <w:t>A seasonal campaign I would discuss is lululemon's 2024 Lunar New Year film, Be Spring. Michelle Yeoh and Wing Chun dancers connect movement with renewal and cultural expression. I find the creative logic strong because the occasion broadens the meaning of movement without replacing the brand's central theme. Its strength is not celebrity visibility alone; it is a culturally relevant interpretation of an existing promise. However, it is a historical example rather than the latest campaign, and public attention does not establish commercial success. I would assess message understanding, relevant audience consideration, and subsequent behaviour before claiming that the creative idea produced incremental business results.</w:t>
       </w:r>
     </w:p>
     <w:p>
@@ -2882,7 +3040,7 @@
         <w:t>中文记忆提纲：</w:t>
       </w:r>
       <w:r>
-        <w:t>Duolingo 2025年2月“Duo is dead”：角色故事＋参与＋品牌一致；传播热度≠已证实商业效果。不是最新活动，面试前按时间更新案例。</w:t>
+        <w:t>第64近期题须注意：2024 Be Spring属历史案例；运动＋新春更新＋中国文化，明星服务主题。正式面试若严格要求近期应换核实的新活动。</w:t>
       </w:r>
     </w:p>
     <w:p>
@@ -2906,12 +3064,12 @@
         <w:rPr>
           <w:b/>
         </w:rPr>
-        <w:t>English answer · 107 words</w:t>
-      </w:r>
-    </w:p>
-    <w:p>
-      <w:r>
-        <w:t>I would research unmet customer demand by combining problem discovery with evidence of willingness to act. First, I would interview and observe customers, non-users, and people who stopped using existing solutions. I would look for repeated frustrations, workarounds, and costs, including time and emotional effort. Next, I would test a simple solution through a prototype or pilot, rather than ask only whether people like the idea. For a learning app, meaningful evidence might include repeated lesson use or payment for a more supportive routine. Finally, I would estimate the segment's size and the cost of serving it. An interesting need is not automatically a viable market opportunity.</w:t>
+        <w:t>English · 107 words</w:t>
+      </w:r>
+    </w:p>
+    <w:p>
+      <w:r>
+        <w:t>I would research unmet demand by looking for a gap between intention and repeated action. In a lululemon-related movement context, many people may want to be active but struggle to join or sustain a routine. I would interview participants, non-participants, and people who stopped attending, then observe where the journey breaks down. Possible barriers should be tested, not assumed. A small pilot could vary information, timing, or support and measure attendance, return behaviour, and willingness to pay where relevant. I would then estimate the segment and delivery costs. This separates an appealing social need from a viable proposition the business can serve without relying on permanent incentives.</w:t>
       </w:r>
     </w:p>
     <w:p>
@@ -2922,7 +3080,7 @@
         <w:t>中文记忆提纲：</w:t>
       </w:r>
       <w:r>
-        <w:t>未满足需求→商业需求：用户/非用户/流失者→痛点和替代成本→试点复用/付费→人群规模/服务成本。喜欢想法不等于会行动。</w:t>
+        <w:t>lululemon未满足需求：意图→持续行动缺口；参与/未参与/退出者→真实断点→信息时段支持试点→复返/付费/规模成本。避免永久补贴。</w:t>
       </w:r>
     </w:p>
     <w:p>
@@ -2946,12 +3104,12 @@
         <w:rPr>
           <w:b/>
         </w:rPr>
-        <w:t>English answer · 108 words</w:t>
-      </w:r>
-    </w:p>
-    <w:p>
-      <w:r>
-        <w:t>To increase website traffic, I would first define which visitors we want and what useful action they should take. Then I would improve technical accessibility and create search-friendly content around genuine customer questions. Relevant partnerships, social content, and permission-based email can bring additional visitors, while paid search can test high-intent demand. I would also check that the landing experience matches the message, because attracting more people to a confusing page wastes resources. For a learning app, I would track engaged visits, qualified registrations, and later usage, not traffic alone. Sustainable growth comes from attracting the right audience and giving them a reason to return or recommend the site.</w:t>
+        <w:t>English · 112 words</w:t>
+      </w:r>
+    </w:p>
+    <w:p>
+      <w:r>
+        <w:t>To increase website traffic, I would first define the visitors whose needs the website can genuinely serve. For DJI, useful content could answer practical questions about choosing Pocket versus Action or completing a filming workflow. Search visibility, relevant creator partnerships, and carefully tested paid search could then bring qualified visitors. For lululemon, clear local activity information may attract people seeking a particular movement experience. I would ensure the destination matches the promise and monitor meaningful next steps, not visits alone. Technical accessibility and performance also matter. The goal is a reliable flow of relevant people who find something useful, rather than traffic growth that produces confusion, immediate exits, or expensive low-quality conversions.</w:t>
       </w:r>
     </w:p>
     <w:p>
@@ -2962,7 +3120,7 @@
         <w:t>中文记忆提纲：</w:t>
       </w:r>
       <w:r>
-        <w:t>网站流量：先定合格人群和动作→技术可访问＋SEO内容→合作/社媒/邮件/搜索广告→落地页匹配。看有效注册与使用，不只访问量。</w:t>
+        <w:t>流量：合格需求→DJI选型/流程搜索内容；lululemon本地活动信息→SEO/创作者/小投放→承诺匹配/技术性能→有用下一步，不刷访问。</w:t>
       </w:r>
     </w:p>
     <w:p>
@@ -2986,12 +3144,12 @@
         <w:rPr>
           <w:b/>
         </w:rPr>
-        <w:t>English answer · 108 words</w:t>
-      </w:r>
-    </w:p>
-    <w:p>
-      <w:r>
-        <w:t>Apple stands out to me because its marketing elements form a consistent system. Clear product positioning, restrained visual presentation, retail experiences, and device integration all support a promise of useful, intuitive technology. Shot on iPhone is a good example: it demonstrates a product benefit through creative outcomes, allowing customers to imagine themselves using the capability. This also connects functional performance with identity and self-expression. However, I would not assume the same strategy suits every audience, because price and flexibility remain important trade-offs. What I admire is the coherence between communication and experience. A memorable campaign becomes more persuasive when the rest of the brand gives customers supporting evidence.</w:t>
+        <w:t>English · 111 words</w:t>
+      </w:r>
+    </w:p>
+    <w:p>
+      <w:r>
+        <w:t>Lululemon stands out to me when its marketing makes movement feel like a practice people can join, not an identity they must already possess. Technical apparel, local ambassadors, and community experiences can reinforce that idea, while Be Spring shows how movement can carry a broader cultural and emotional meaning. This is my interpretation of the strategic opportunity, not proof that every customer feels included. The critical test is whether the invitation remains believable for newcomers and different ability levels. I would strengthen the approach by connecting inspiration with clear, achievable next steps. Distinctive marketing should make belonging actionable, rather than rely on aspirational imagery that customers admire but cannot comfortably enter.</w:t>
       </w:r>
     </w:p>
     <w:p>
@@ -3002,7 +3160,50 @@
         <w:t>中文记忆提纲：</w:t>
       </w:r>
       <w:r>
-        <w:t>Apple综合复用：定位/视觉/门店/生态一致→Shot on iPhone证明能力与自我表达；价格/自由度权衡。广告可信来自体验支撑。</w:t>
+        <w:t>lululemon收束：运动是可加入的实践，非必须先拥有的身份；服装/大使/社区/Be Spring共用。建议把激励接可实现下一步；看新人能否进入。</w:t>
+      </w:r>
+    </w:p>
+    <w:p>
+      <w:pPr>
+        <w:pStyle w:val="Heading1"/>
+      </w:pPr>
+      <w:r>
+        <w:t>官网参考入口与核实清单</w:t>
+      </w:r>
+    </w:p>
+    <w:p>
+      <w:r>
+        <w:t>以下是供核实的官方入口，不能视为本轮已读取的来源。官网请求两轮均返回代理403；没有核实最新型号、最新活动、地区会员权益或业绩数据。</w:t>
+      </w:r>
+    </w:p>
+    <w:p>
+      <w:r>
+        <w:t>DJI Osmo Pocket 3：产品定位与型号功能参考：https://www.dji.com/osmo-pocket-3</w:t>
+      </w:r>
+    </w:p>
+    <w:p>
+      <w:r>
+        <w:t>DJI Osmo Action 5 Pro：产品定位与型号功能参考：https://www.dji.com/osmo-action-5-pro</w:t>
+      </w:r>
+    </w:p>
+    <w:p>
+      <w:r>
+        <w:t>lululemon官方新闻目录：搜索2024 Lunar New Year、Be Spring、Michelle Yeoh：https://corporate.lululemon.com/media/press-releases</w:t>
+      </w:r>
+    </w:p>
+    <w:p>
+      <w:r>
+        <w:t>lululemon社区资料入口：https://shop.lululemon.com/story/community</w:t>
+      </w:r>
+    </w:p>
+    <w:p>
+      <w:r>
+        <w:t>lululemon会员资料入口：地区权益可能不同：https://shop.lululemon.com/membership</w:t>
+      </w:r>
+    </w:p>
+    <w:p>
+      <w:r>
+        <w:t>核实优先级：①第64题近期活动的日期/主题/内容；②Be Spring片名、演员与文化表达；③Pocket/Action具体型号用途与限制；④会员地区规则。若没有可靠数据，只评价策略机制，不声称销售或形象改变已被证明。</w:t>
       </w:r>
     </w:p>
     <w:sectPr>
@@ -3024,7 +3225,7 @@
       <w:jc w:val="right"/>
     </w:pPr>
     <w:r>
-      <w:t xml:space="preserve">IC Strategic Marketing · </w:t>
+      <w:t xml:space="preserve">DJI × lululemon · </w:t>
     </w:r>
     <w:fldSimple w:instr="PAGE"/>
   </w:p>

</xml_diff>